<commit_message>
Task2 for linal project implemented
</commit_message>
<xml_diff>
--- a/linal/report.docx
+++ b/linal/report.docx
@@ -1,10 +1,10 @@
 
 <file path=word/document.xml><?xml version="1.0" encoding="utf-8"?>
-<w:document xmlns:wpc="http://schemas.microsoft.com/office/word/2010/wordprocessingCanvas" xmlns:cx="http://schemas.microsoft.com/office/drawing/2014/chartex" xmlns:cx1="http://schemas.microsoft.com/office/drawing/2015/9/8/chartex" xmlns:cx2="http://schemas.microsoft.com/office/drawing/2015/10/21/chartex" xmlns:cx3="http://schemas.microsoft.com/office/drawing/2016/5/9/chartex" xmlns:cx4="http://schemas.microsoft.com/office/drawing/2016/5/10/chartex" xmlns:cx5="http://schemas.microsoft.com/office/drawing/2016/5/11/chartex" xmlns:cx6="http://schemas.microsoft.com/office/drawing/2016/5/12/chartex" xmlns:cx7="http://schemas.microsoft.com/office/drawing/2016/5/13/chartex" xmlns:cx8="http://schemas.microsoft.com/office/drawing/2016/5/14/chartex" xmlns:mc="http://schemas.openxmlformats.org/markup-compatibility/2006" xmlns:aink="http://schemas.microsoft.com/office/drawing/2016/ink" xmlns:am3d="http://schemas.microsoft.com/office/drawing/2017/model3d" xmlns:o="urn:schemas-microsoft-com:office:office" xmlns:oel="http://schemas.microsoft.com/office/2019/extlst" xmlns:r="http://schemas.openxmlformats.org/officeDocument/2006/relationships" xmlns:m="http://schemas.openxmlformats.org/officeDocument/2006/math" xmlns:v="urn:schemas-microsoft-com:vml" xmlns:wp14="http://schemas.microsoft.com/office/word/2010/wordprocessingDrawing" xmlns:wp="http://schemas.openxmlformats.org/drawingml/2006/wordprocessingDrawing" xmlns:w10="urn:schemas-microsoft-com:office:word" xmlns:w="http://schemas.openxmlformats.org/wordprocessingml/2006/main" xmlns:w14="http://schemas.microsoft.com/office/word/2010/wordml" xmlns:w15="http://schemas.microsoft.com/office/word/2012/wordml" xmlns:w16cex="http://schemas.microsoft.com/office/word/2018/wordml/cex" xmlns:w16cid="http://schemas.microsoft.com/office/word/2016/wordml/cid" xmlns:w16="http://schemas.microsoft.com/office/word/2018/wordml" xmlns:w16du="http://schemas.microsoft.com/office/word/2023/wordml/word16du" xmlns:w16sdtdh="http://schemas.microsoft.com/office/word/2020/wordml/sdtdatahash" xmlns:w16sdtfl="http://schemas.microsoft.com/office/word/2024/wordml/sdtformatlock" xmlns:w16se="http://schemas.microsoft.com/office/word/2015/wordml/symex" xmlns:wpg="http://schemas.microsoft.com/office/word/2010/wordprocessingGroup" xmlns:wpi="http://schemas.microsoft.com/office/word/2010/wordprocessingInk" xmlns:wne="http://schemas.microsoft.com/office/word/2006/wordml" xmlns:wps="http://schemas.microsoft.com/office/word/2010/wordprocessingShape" mc:Ignorable="w14 w15 w16se w16cid w16 w16cex w16sdtdh w16sdtfl w16du wp14">
+<w:document xmlns:wpc="http://schemas.microsoft.com/office/word/2010/wordprocessingCanvas" xmlns:cx="http://schemas.microsoft.com/office/drawing/2014/chartex" xmlns:cx1="http://schemas.microsoft.com/office/drawing/2015/9/8/chartex" xmlns:cx2="http://schemas.microsoft.com/office/drawing/2015/10/21/chartex" xmlns:cx3="http://schemas.microsoft.com/office/drawing/2016/5/9/chartex" xmlns:cx4="http://schemas.microsoft.com/office/drawing/2016/5/10/chartex" xmlns:cx5="http://schemas.microsoft.com/office/drawing/2016/5/11/chartex" xmlns:cx6="http://schemas.microsoft.com/office/drawing/2016/5/12/chartex" xmlns:cx7="http://schemas.microsoft.com/office/drawing/2016/5/13/chartex" xmlns:cx8="http://schemas.microsoft.com/office/drawing/2016/5/14/chartex" xmlns:mc="http://schemas.openxmlformats.org/markup-compatibility/2006" xmlns:aink="http://schemas.microsoft.com/office/drawing/2016/ink" xmlns:am3d="http://schemas.microsoft.com/office/drawing/2017/model3d" xmlns:o="urn:schemas-microsoft-com:office:office" xmlns:oel="http://schemas.microsoft.com/office/2019/extlst" xmlns:r="http://schemas.openxmlformats.org/officeDocument/2006/relationships" xmlns:m="http://schemas.openxmlformats.org/officeDocument/2006/math" xmlns:v="urn:schemas-microsoft-com:vml" xmlns:wp14="http://schemas.microsoft.com/office/word/2010/wordprocessingDrawing" xmlns:wp="http://schemas.openxmlformats.org/drawingml/2006/wordprocessingDrawing" xmlns:w10="urn:schemas-microsoft-com:office:word" xmlns:w="http://schemas.openxmlformats.org/wordprocessingml/2006/main" xmlns:w14="http://schemas.microsoft.com/office/word/2010/wordml" xmlns:w15="http://schemas.microsoft.com/office/word/2012/wordml" xmlns:w16cex="http://schemas.microsoft.com/office/word/2018/wordml/cex" xmlns:w16cid="http://schemas.microsoft.com/office/word/2016/wordml/cid" xmlns:w16="http://schemas.microsoft.com/office/word/2018/wordml" xmlns:w16sdtdh="http://schemas.microsoft.com/office/word/2020/wordml/sdtdatahash" xmlns:w16se="http://schemas.microsoft.com/office/word/2015/wordml/symex" xmlns:wpg="http://schemas.microsoft.com/office/word/2010/wordprocessingGroup" xmlns:wpi="http://schemas.microsoft.com/office/word/2010/wordprocessingInk" xmlns:wne="http://schemas.microsoft.com/office/word/2006/wordml" xmlns:wps="http://schemas.microsoft.com/office/word/2010/wordprocessingShape" mc:Ignorable="w14 w15 w16se w16cid w16 w16cex w16sdtdh wp14">
   <w:body>
     <w:p>
       <w:pPr>
-        <w:pStyle w:val="Heading2"/>
+        <w:pStyle w:val="2"/>
         <w:jc w:val="center"/>
       </w:pPr>
       <w:r>
@@ -13,7 +13,7 @@
     </w:p>
     <w:p>
       <w:pPr>
-        <w:pStyle w:val="Heading3"/>
+        <w:pStyle w:val="3"/>
         <w:rPr>
           <w:lang w:val="en-US"/>
         </w:rPr>
@@ -30,7 +30,7 @@
     </w:p>
     <w:p>
       <w:pPr>
-        <w:pStyle w:val="ListParagraph"/>
+        <w:pStyle w:val="a7"/>
         <w:numPr>
           <w:ilvl w:val="0"/>
           <w:numId w:val="9"/>
@@ -43,12 +43,20 @@
         <w:t>-</w:t>
       </w:r>
       <w:r>
-        <w:t xml:space="preserve">нибудь ключ размера 2 × 2. В идеале автоматизировать процесс так, чтобы ключ сгенерировался случайным образом и вы не знали его до самого конца. </w:t>
-      </w:r>
-    </w:p>
-    <w:p>
-      <w:pPr>
-        <w:pStyle w:val="ListParagraph"/>
+        <w:t xml:space="preserve">нибудь ключ размера 2 × 2. В идеале автоматизировать процесс так, чтобы ключ сгенерировался </w:t>
+      </w:r>
+      <w:proofErr w:type="gramStart"/>
+      <w:r>
+        <w:t>случайным образом</w:t>
+      </w:r>
+      <w:proofErr w:type="gramEnd"/>
+      <w:r>
+        <w:t xml:space="preserve"> и вы не знали его до самого конца. </w:t>
+      </w:r>
+    </w:p>
+    <w:p>
+      <w:pPr>
+        <w:pStyle w:val="a7"/>
         <w:numPr>
           <w:ilvl w:val="0"/>
           <w:numId w:val="9"/>
@@ -60,7 +68,7 @@
     </w:p>
     <w:p>
       <w:pPr>
-        <w:pStyle w:val="ListParagraph"/>
+        <w:pStyle w:val="a7"/>
         <w:numPr>
           <w:ilvl w:val="0"/>
           <w:numId w:val="9"/>
@@ -72,7 +80,7 @@
     </w:p>
     <w:p>
       <w:pPr>
-        <w:pStyle w:val="ListParagraph"/>
+        <w:pStyle w:val="a7"/>
       </w:pPr>
       <w:r>
         <w:t>расшифровать второе сообщение.</w:t>
@@ -81,35 +89,28 @@
     <w:p/>
     <w:p>
       <w:pPr>
-        <w:pStyle w:val="Heading3"/>
+        <w:pStyle w:val="3"/>
         <w:jc w:val="center"/>
       </w:pPr>
       <w:r>
         <w:t>1.</w:t>
       </w:r>
       <w:r>
-        <w:rPr>
-          <w:lang w:val="en-US"/>
-        </w:rPr>
         <w:t xml:space="preserve"> </w:t>
       </w:r>
       <w:r>
+        <w:rPr>
+          <w:b/>
+          <w:bCs/>
+        </w:rPr>
         <w:t>Немного вводных</w:t>
       </w:r>
     </w:p>
     <w:p>
-      <w:pPr>
-        <w:rPr>
-          <w:lang w:val="en-US"/>
-        </w:rPr>
-      </w:pPr>
       <w:r>
         <w:t>Алфавит</w:t>
       </w:r>
       <w:r>
-        <w:rPr>
-          <w:lang w:val="en-US"/>
-        </w:rPr>
         <w:t>:</w:t>
       </w:r>
     </w:p>
@@ -132,7 +133,7 @@
     </w:p>
     <w:tbl>
       <w:tblPr>
-        <w:tblStyle w:val="TableGrid"/>
+        <w:tblStyle w:val="af8"/>
         <w:tblW w:w="9344" w:type="dxa"/>
         <w:tblLook w:val="04A0" w:firstRow="1" w:lastRow="0" w:firstColumn="1" w:lastColumn="0" w:noHBand="0" w:noVBand="1"/>
       </w:tblPr>
@@ -1141,7 +1142,7 @@
     </w:p>
     <w:tbl>
       <w:tblPr>
-        <w:tblStyle w:val="TableGrid"/>
+        <w:tblStyle w:val="af8"/>
         <w:tblW w:w="0" w:type="auto"/>
         <w:tblLook w:val="04A0" w:firstRow="1" w:lastRow="0" w:firstColumn="1" w:lastColumn="0" w:noHBand="0" w:noVBand="1"/>
       </w:tblPr>
@@ -2020,7 +2021,6 @@
         <w:rPr>
           <w:sz w:val="28"/>
           <w:szCs w:val="28"/>
-          <w:lang w:val="en-US"/>
         </w:rPr>
       </w:pPr>
       <w:r>
@@ -2028,7 +2028,7 @@
           <w:sz w:val="28"/>
           <w:szCs w:val="28"/>
         </w:rPr>
-        <w:t>Ключ шифра Хилла представляет собой квадратную матрицу второго порядка:</w:t>
+        <w:t>Ключ шифра Хилла представляет собой квадратную матрицу:</w:t>
       </w:r>
     </w:p>
     <w:p>
@@ -2044,21 +2044,23 @@
           <w:sz w:val="28"/>
           <w:szCs w:val="28"/>
         </w:rPr>
-        <w:t>K =</w:t>
-      </w:r>
+        <w:t xml:space="preserve">K = </w:t>
+      </w:r>
+      <w:proofErr w:type="gramStart"/>
       <w:r>
         <w:rPr>
           <w:sz w:val="28"/>
           <w:szCs w:val="28"/>
         </w:rPr>
-        <w:t xml:space="preserve"> </w:t>
-      </w:r>
+        <w:t>[ k</w:t>
+      </w:r>
+      <w:proofErr w:type="gramEnd"/>
       <w:r>
         <w:rPr>
           <w:sz w:val="28"/>
           <w:szCs w:val="28"/>
         </w:rPr>
-        <w:t>[ k₁₁</w:t>
+        <w:t>₁₁</w:t>
       </w:r>
       <w:r>
         <w:rPr>
@@ -2092,12 +2094,21 @@
         </w:rPr>
         <w:t xml:space="preserve">       </w:t>
       </w:r>
+      <w:proofErr w:type="gramStart"/>
       <w:r>
         <w:rPr>
           <w:sz w:val="28"/>
           <w:szCs w:val="28"/>
         </w:rPr>
-        <w:t>[ k₂₁</w:t>
+        <w:t>[ k</w:t>
+      </w:r>
+      <w:proofErr w:type="gramEnd"/>
+      <w:r>
+        <w:rPr>
+          <w:sz w:val="28"/>
+          <w:szCs w:val="28"/>
+        </w:rPr>
+        <w:t>₂₁</w:t>
       </w:r>
       <w:r>
         <w:rPr>
@@ -2122,7 +2133,6 @@
         <w:rPr>
           <w:sz w:val="28"/>
           <w:szCs w:val="28"/>
-          <w:lang w:val="en-US"/>
         </w:rPr>
       </w:pPr>
       <w:r>
@@ -2139,6 +2149,7 @@
         <w:rPr>
           <w:sz w:val="28"/>
           <w:szCs w:val="28"/>
+          <w:lang w:val="en-US"/>
         </w:rPr>
       </w:pPr>
       <w:r>
@@ -2170,56 +2181,79 @@
         <w:rPr>
           <w:sz w:val="28"/>
           <w:szCs w:val="28"/>
-          <w:lang w:val="en-US"/>
         </w:rPr>
         <w:t xml:space="preserve"> </w:t>
       </w:r>
+      <w:proofErr w:type="gramStart"/>
       <w:r>
         <w:rPr>
           <w:sz w:val="28"/>
           <w:szCs w:val="28"/>
         </w:rPr>
-        <w:t>[ p₁ ]</w:t>
-      </w:r>
-    </w:p>
-    <w:p>
-      <w:pPr>
-        <w:pStyle w:val="p1"/>
+        <w:t>[ p</w:t>
+      </w:r>
+      <w:proofErr w:type="gramEnd"/>
+      <w:r>
         <w:rPr>
           <w:sz w:val="28"/>
           <w:szCs w:val="28"/>
-          <w:lang w:val="en-US"/>
-        </w:rPr>
-      </w:pPr>
-      <w:r>
+        </w:rPr>
+        <w:t xml:space="preserve">₁ </w:t>
+      </w:r>
+    </w:p>
+    <w:p>
+      <w:pPr>
+        <w:pStyle w:val="p1"/>
         <w:rPr>
           <w:sz w:val="28"/>
           <w:szCs w:val="28"/>
-          <w:lang w:val="en-US"/>
-        </w:rPr>
-        <w:t xml:space="preserve">       </w:t>
-      </w:r>
+        </w:rPr>
+      </w:pPr>
       <w:r>
         <w:rPr>
           <w:sz w:val="28"/>
           <w:szCs w:val="28"/>
         </w:rPr>
-        <w:t>[ p₂ ]</w:t>
-      </w:r>
-    </w:p>
-    <w:p>
-      <w:pPr>
-        <w:pStyle w:val="p1"/>
+        <w:t xml:space="preserve">       </w:t>
+      </w:r>
+      <w:r>
         <w:rPr>
           <w:sz w:val="28"/>
           <w:szCs w:val="28"/>
-        </w:rPr>
-      </w:pPr>
+          <w:lang w:val="en-US"/>
+        </w:rPr>
+        <w:t xml:space="preserve"> </w:t>
+      </w:r>
       <w:r>
         <w:rPr>
           <w:sz w:val="28"/>
           <w:szCs w:val="28"/>
         </w:rPr>
+        <w:t xml:space="preserve"> p</w:t>
+      </w:r>
+      <w:proofErr w:type="gramStart"/>
+      <w:r>
+        <w:rPr>
+          <w:sz w:val="28"/>
+          <w:szCs w:val="28"/>
+        </w:rPr>
+        <w:t>₂ ]</w:t>
+      </w:r>
+      <w:proofErr w:type="gramEnd"/>
+    </w:p>
+    <w:p>
+      <w:pPr>
+        <w:pStyle w:val="p1"/>
+        <w:rPr>
+          <w:sz w:val="28"/>
+          <w:szCs w:val="28"/>
+        </w:rPr>
+      </w:pPr>
+      <w:r>
+        <w:rPr>
+          <w:sz w:val="28"/>
+          <w:szCs w:val="28"/>
+        </w:rPr>
         <w:lastRenderedPageBreak/>
         <w:t>Шифрование одного блока выполняется по формуле:</w:t>
       </w:r>
@@ -2230,7 +2264,6 @@
         <w:rPr>
           <w:sz w:val="28"/>
           <w:szCs w:val="28"/>
-          <w:lang w:val="en-US"/>
         </w:rPr>
       </w:pPr>
       <w:r>
@@ -2291,7 +2324,7 @@
     </w:p>
     <w:p>
       <w:pPr>
-        <w:pStyle w:val="Heading3"/>
+        <w:pStyle w:val="3"/>
         <w:jc w:val="center"/>
         <w:rPr>
           <w:rFonts w:cs="Times New Roman"/>
@@ -2307,6 +2340,8 @@
       <w:r>
         <w:rPr>
           <w:rFonts w:cs="Times New Roman"/>
+          <w:b/>
+          <w:bCs/>
         </w:rPr>
         <w:t>Задача</w:t>
       </w:r>
@@ -2414,7 +2449,21 @@
           <w:sz w:val="28"/>
           <w:szCs w:val="28"/>
         </w:rPr>
-        <w:t>и далее расшифровать 2 сообщение</w:t>
+        <w:t xml:space="preserve">и далее расшифровать </w:t>
+      </w:r>
+      <w:r>
+        <w:rPr>
+          <w:sz w:val="28"/>
+          <w:szCs w:val="28"/>
+        </w:rPr>
+        <w:t>второе</w:t>
+      </w:r>
+      <w:r>
+        <w:rPr>
+          <w:sz w:val="28"/>
+          <w:szCs w:val="28"/>
+        </w:rPr>
+        <w:t xml:space="preserve"> сообщение</w:t>
       </w:r>
     </w:p>
     <w:p>
@@ -2427,132 +2476,138 @@
     </w:p>
     <w:p>
       <w:pPr>
-        <w:pStyle w:val="Heading3"/>
+        <w:pStyle w:val="3"/>
         <w:jc w:val="center"/>
-      </w:pPr>
-      <w:r>
-        <w:rPr>
-          <w:lang w:val="en-US"/>
-        </w:rPr>
+        <w:rPr>
+          <w:b/>
+          <w:bCs/>
+        </w:rPr>
+      </w:pPr>
+      <w:r>
+        <w:rPr>
+          <w:b/>
+          <w:bCs/>
+        </w:rPr>
+        <w:t>3. Алгоритм</w:t>
+      </w:r>
+      <w:r>
+        <w:rPr>
+          <w:b/>
+          <w:bCs/>
+        </w:rPr>
+        <w:t xml:space="preserve"> нахождения ключа</w:t>
+      </w:r>
+    </w:p>
+    <w:p>
+      <w:r>
+        <w:t>1</w:t>
+      </w:r>
+      <w:r>
+        <w:t xml:space="preserve">. </w:t>
+      </w:r>
+      <w:r>
+        <w:t>Открытый</w:t>
+      </w:r>
+      <w:r>
+        <w:t xml:space="preserve"> </w:t>
+      </w:r>
+      <w:r>
+        <w:t>и зашифрованный текст разбиваются на блоки по 2 символа</w:t>
+      </w:r>
+      <w:r>
+        <w:t>.</w:t>
+      </w:r>
+    </w:p>
+    <w:p>
+      <w:r>
+        <w:t>2</w:t>
+      </w:r>
+      <w:r>
+        <w:t xml:space="preserve">. </w:t>
+      </w:r>
+      <w:r>
+        <w:t xml:space="preserve">Из открытого текста выбираются 2 блока </w:t>
+      </w:r>
+      <w:r>
+        <w:rPr>
+          <w:lang w:val="en-US"/>
+        </w:rPr>
+        <w:t>P</w:t>
+      </w:r>
+      <w:r>
+        <w:rPr>
+          <w:vertAlign w:val="subscript"/>
+          <w:lang w:val="en-US"/>
+        </w:rPr>
+        <w:t>i</w:t>
+      </w:r>
+      <w:r>
+        <w:t xml:space="preserve"> </w:t>
+      </w:r>
+      <w:r>
+        <w:t xml:space="preserve">и </w:t>
+      </w:r>
+      <w:proofErr w:type="spellStart"/>
+      <w:r>
+        <w:rPr>
+          <w:lang w:val="en-US"/>
+        </w:rPr>
+        <w:t>P</w:t>
+      </w:r>
+      <w:r>
+        <w:rPr>
+          <w:vertAlign w:val="subscript"/>
+          <w:lang w:val="en-US"/>
+        </w:rPr>
+        <w:t>j</w:t>
+      </w:r>
+      <w:proofErr w:type="spellEnd"/>
+      <w:r>
+        <w:t xml:space="preserve">, </w:t>
+      </w:r>
+      <w:r>
+        <w:t xml:space="preserve">из них составляется матрица </w:t>
+      </w:r>
+      <w:r>
+        <w:rPr>
+          <w:lang w:val="en-US"/>
+        </w:rPr>
+        <w:t>P</w:t>
+      </w:r>
+      <w:r>
+        <w:t>.</w:t>
+      </w:r>
+    </w:p>
+    <w:p>
+      <w:r>
         <w:t xml:space="preserve">3. </w:t>
       </w:r>
       <w:r>
-        <w:t>Алгоритм</w:t>
-      </w:r>
-      <w:r>
-        <w:t xml:space="preserve"> нахождения ключа</w:t>
-      </w:r>
-    </w:p>
-    <w:p>
-      <w:r>
-        <w:t>1</w:t>
-      </w:r>
-      <w:r>
-        <w:t xml:space="preserve">. </w:t>
-      </w:r>
-      <w:r>
-        <w:t>Открытый</w:t>
+        <w:t xml:space="preserve">Вычисляем </w:t>
+      </w:r>
+      <w:r>
+        <w:rPr>
+          <w:lang w:val="en-US"/>
+        </w:rPr>
+        <w:t>det</w:t>
       </w:r>
       <w:r>
         <w:t xml:space="preserve"> </w:t>
       </w:r>
       <w:r>
-        <w:t>и зашифрованный текст разбиваются на блоки по 2 символа</w:t>
+        <w:rPr>
+          <w:lang w:val="en-US"/>
+        </w:rPr>
+        <w:t>P</w:t>
       </w:r>
       <w:r>
         <w:t>.</w:t>
       </w:r>
     </w:p>
     <w:p>
-      <w:r>
-        <w:t>2</w:t>
-      </w:r>
-      <w:r>
-        <w:t xml:space="preserve">. </w:t>
-      </w:r>
-      <w:r>
-        <w:t xml:space="preserve">Из открытого текста выбираются 2 блока </w:t>
-      </w:r>
-      <w:r>
-        <w:rPr>
-          <w:lang w:val="en-US"/>
-        </w:rPr>
-        <w:t>P</w:t>
-      </w:r>
-      <w:r>
-        <w:rPr>
-          <w:vertAlign w:val="subscript"/>
-          <w:lang w:val="en-US"/>
-        </w:rPr>
-        <w:t>i</w:t>
-      </w:r>
-      <w:r>
-        <w:t xml:space="preserve"> </w:t>
-      </w:r>
-      <w:r>
-        <w:t xml:space="preserve">и </w:t>
-      </w:r>
-      <w:proofErr w:type="spellStart"/>
-      <w:r>
-        <w:rPr>
-          <w:lang w:val="en-US"/>
-        </w:rPr>
-        <w:t>P</w:t>
-      </w:r>
-      <w:r>
-        <w:rPr>
-          <w:vertAlign w:val="subscript"/>
-          <w:lang w:val="en-US"/>
-        </w:rPr>
-        <w:t>j</w:t>
-      </w:r>
-      <w:proofErr w:type="spellEnd"/>
-      <w:r>
-        <w:t xml:space="preserve">, </w:t>
-      </w:r>
-      <w:r>
-        <w:t xml:space="preserve">из них составляется матрица </w:t>
-      </w:r>
-      <w:r>
-        <w:rPr>
-          <w:lang w:val="en-US"/>
-        </w:rPr>
-        <w:t>P</w:t>
-      </w:r>
-      <w:r>
-        <w:t>.</w:t>
-      </w:r>
-    </w:p>
-    <w:p>
-      <w:r>
-        <w:t xml:space="preserve">3. </w:t>
-      </w:r>
-      <w:r>
-        <w:t xml:space="preserve">Вычисляем </w:t>
-      </w:r>
-      <w:r>
-        <w:rPr>
-          <w:lang w:val="en-US"/>
-        </w:rPr>
-        <w:t>det</w:t>
-      </w:r>
-      <w:r>
-        <w:t xml:space="preserve"> </w:t>
-      </w:r>
-      <w:r>
-        <w:rPr>
-          <w:lang w:val="en-US"/>
-        </w:rPr>
-        <w:t>P</w:t>
-      </w:r>
-      <w:r>
-        <w:t>.</w:t>
-      </w:r>
-    </w:p>
-    <w:p>
-      <w:pPr>
-        <w:rPr>
-          <w:rStyle w:val="Strong"/>
+      <w:pPr>
+        <w:rPr>
+          <w:rStyle w:val="af9"/>
           <w:rFonts w:cs="Times New Roman"/>
           <w:b w:val="0"/>
           <w:bCs w:val="0"/>
@@ -2561,8 +2616,13 @@
         </w:rPr>
       </w:pPr>
       <w:r>
-        <w:t>Если НОД(</w:t>
-      </w:r>
+        <w:t xml:space="preserve">Если </w:t>
+      </w:r>
+      <w:proofErr w:type="gramStart"/>
+      <w:r>
+        <w:t>НОД(</w:t>
+      </w:r>
+      <w:proofErr w:type="gramEnd"/>
       <w:r>
         <w:rPr>
           <w:lang w:val="en-US"/>
@@ -2591,14 +2651,11 @@
         <w:t>)</w:t>
       </w:r>
       <w:r>
-        <w:t xml:space="preserve"> </w:t>
-      </w:r>
-      <w:r>
-        <w:t>≠</w:t>
-      </w:r>
-      <w:r>
-        <w:rPr>
-          <w:rStyle w:val="Strong"/>
+        <w:t xml:space="preserve"> ≠</w:t>
+      </w:r>
+      <w:r>
+        <w:rPr>
+          <w:rStyle w:val="af9"/>
           <w:rFonts w:ascii="Arial" w:hAnsi="Arial" w:cs="Arial"/>
           <w:color w:val="001D35"/>
           <w:shd w:val="clear" w:color="auto" w:fill="FFFFFF"/>
@@ -2607,7 +2664,7 @@
       </w:r>
       <w:r>
         <w:rPr>
-          <w:rStyle w:val="Strong"/>
+          <w:rStyle w:val="af9"/>
           <w:rFonts w:cs="Times New Roman"/>
           <w:b w:val="0"/>
           <w:bCs w:val="0"/>
@@ -2618,7 +2675,7 @@
       </w:r>
       <w:r>
         <w:rPr>
-          <w:rStyle w:val="Strong"/>
+          <w:rStyle w:val="af9"/>
           <w:rFonts w:cs="Times New Roman"/>
           <w:b w:val="0"/>
           <w:bCs w:val="0"/>
@@ -2629,7 +2686,7 @@
       </w:r>
       <w:r>
         <w:rPr>
-          <w:rStyle w:val="Strong"/>
+          <w:rStyle w:val="af9"/>
           <w:rFonts w:cs="Times New Roman"/>
           <w:b w:val="0"/>
           <w:bCs w:val="0"/>
@@ -2640,7 +2697,7 @@
       </w:r>
       <w:r>
         <w:rPr>
-          <w:rStyle w:val="Strong"/>
+          <w:rStyle w:val="af9"/>
           <w:rFonts w:cs="Times New Roman"/>
           <w:b w:val="0"/>
           <w:bCs w:val="0"/>
@@ -2651,7 +2708,7 @@
       </w:r>
       <w:r>
         <w:rPr>
-          <w:rStyle w:val="Strong"/>
+          <w:rStyle w:val="af9"/>
           <w:rFonts w:cs="Times New Roman"/>
           <w:b w:val="0"/>
           <w:bCs w:val="0"/>
@@ -2664,7 +2721,7 @@
     <w:p>
       <w:pPr>
         <w:rPr>
-          <w:rStyle w:val="Strong"/>
+          <w:rStyle w:val="af9"/>
           <w:rFonts w:cs="Times New Roman"/>
           <w:b w:val="0"/>
           <w:bCs w:val="0"/>
@@ -2674,7 +2731,7 @@
       </w:pPr>
       <w:r>
         <w:rPr>
-          <w:rStyle w:val="Strong"/>
+          <w:rStyle w:val="af9"/>
           <w:rFonts w:cs="Times New Roman"/>
           <w:b w:val="0"/>
           <w:bCs w:val="0"/>
@@ -2685,7 +2742,7 @@
       </w:r>
       <w:r>
         <w:rPr>
-          <w:rStyle w:val="Strong"/>
+          <w:rStyle w:val="af9"/>
           <w:rFonts w:cs="Times New Roman"/>
           <w:b w:val="0"/>
           <w:bCs w:val="0"/>
@@ -2696,7 +2753,7 @@
       </w:r>
       <w:r>
         <w:rPr>
-          <w:rStyle w:val="Strong"/>
+          <w:rStyle w:val="af9"/>
           <w:rFonts w:cs="Times New Roman"/>
           <w:b w:val="0"/>
           <w:bCs w:val="0"/>
@@ -2708,7 +2765,7 @@
       </w:r>
       <w:r>
         <w:rPr>
-          <w:rStyle w:val="Strong"/>
+          <w:rStyle w:val="af9"/>
           <w:rFonts w:cs="Times New Roman"/>
           <w:b w:val="0"/>
           <w:bCs w:val="0"/>
@@ -2719,7 +2776,7 @@
       </w:r>
       <w:r>
         <w:rPr>
-          <w:rStyle w:val="Strong"/>
+          <w:rStyle w:val="af9"/>
           <w:rFonts w:cs="Times New Roman"/>
           <w:b w:val="0"/>
           <w:bCs w:val="0"/>
@@ -2730,7 +2787,7 @@
       </w:r>
       <w:r>
         <w:rPr>
-          <w:rStyle w:val="Strong"/>
+          <w:rStyle w:val="af9"/>
           <w:rFonts w:cs="Times New Roman"/>
           <w:b w:val="0"/>
           <w:bCs w:val="0"/>
@@ -2741,7 +2798,7 @@
       </w:r>
       <w:r>
         <w:rPr>
-          <w:rStyle w:val="Strong"/>
+          <w:rStyle w:val="af9"/>
           <w:rFonts w:cs="Times New Roman"/>
           <w:b w:val="0"/>
           <w:bCs w:val="0"/>
@@ -2752,7 +2809,7 @@
       </w:r>
       <w:r>
         <w:rPr>
-          <w:rStyle w:val="Strong"/>
+          <w:rStyle w:val="af9"/>
           <w:rFonts w:cs="Times New Roman"/>
           <w:b w:val="0"/>
           <w:bCs w:val="0"/>
@@ -2763,7 +2820,7 @@
       </w:r>
       <w:r>
         <w:rPr>
-          <w:rStyle w:val="Strong"/>
+          <w:rStyle w:val="af9"/>
           <w:rFonts w:cs="Times New Roman"/>
           <w:b w:val="0"/>
           <w:bCs w:val="0"/>
@@ -2775,7 +2832,7 @@
       </w:r>
       <w:r>
         <w:rPr>
-          <w:rStyle w:val="Strong"/>
+          <w:rStyle w:val="af9"/>
           <w:rFonts w:cs="Times New Roman"/>
           <w:b w:val="0"/>
           <w:bCs w:val="0"/>
@@ -2788,18 +2845,17 @@
     <w:p>
       <w:pPr>
         <w:rPr>
-          <w:rStyle w:val="Strong"/>
+          <w:rStyle w:val="af9"/>
           <w:rFonts w:cs="Times New Roman"/>
           <w:b w:val="0"/>
           <w:bCs w:val="0"/>
           <w:color w:val="001D35"/>
           <w:shd w:val="clear" w:color="auto" w:fill="FFFFFF"/>
-          <w:lang w:val="en-US"/>
-        </w:rPr>
-      </w:pPr>
-      <w:r>
-        <w:rPr>
-          <w:rStyle w:val="Strong"/>
+        </w:rPr>
+      </w:pPr>
+      <w:r>
+        <w:rPr>
+          <w:rStyle w:val="af9"/>
           <w:rFonts w:cs="Times New Roman"/>
           <w:b w:val="0"/>
           <w:bCs w:val="0"/>
@@ -2810,19 +2866,18 @@
       </w:r>
       <w:r>
         <w:rPr>
-          <w:rStyle w:val="Strong"/>
+          <w:rStyle w:val="af9"/>
           <w:rFonts w:cs="Times New Roman"/>
           <w:b w:val="0"/>
           <w:bCs w:val="0"/>
           <w:color w:val="001D35"/>
           <w:shd w:val="clear" w:color="auto" w:fill="FFFFFF"/>
-          <w:lang w:val="en-US"/>
         </w:rPr>
         <w:t xml:space="preserve"> </w:t>
       </w:r>
       <w:r>
         <w:rPr>
-          <w:rStyle w:val="Strong"/>
+          <w:rStyle w:val="af9"/>
           <w:rFonts w:cs="Times New Roman"/>
           <w:b w:val="0"/>
           <w:bCs w:val="0"/>
@@ -2833,7 +2888,7 @@
       </w:r>
       <w:r>
         <w:rPr>
-          <w:rStyle w:val="Strong"/>
+          <w:rStyle w:val="af9"/>
           <w:rFonts w:cs="Times New Roman"/>
           <w:b w:val="0"/>
           <w:bCs w:val="0"/>
@@ -2845,26 +2900,24 @@
       </w:r>
       <w:r>
         <w:rPr>
-          <w:rStyle w:val="Strong"/>
+          <w:rStyle w:val="af9"/>
           <w:rFonts w:cs="Times New Roman"/>
           <w:b w:val="0"/>
           <w:bCs w:val="0"/>
           <w:color w:val="001D35"/>
           <w:shd w:val="clear" w:color="auto" w:fill="FFFFFF"/>
           <w:vertAlign w:val="superscript"/>
-          <w:lang w:val="en-US"/>
         </w:rPr>
         <w:t>-1</w:t>
       </w:r>
       <w:r>
         <w:rPr>
-          <w:rStyle w:val="Strong"/>
+          <w:rStyle w:val="af9"/>
           <w:rFonts w:cs="Times New Roman"/>
           <w:b w:val="0"/>
           <w:bCs w:val="0"/>
           <w:color w:val="001D35"/>
           <w:shd w:val="clear" w:color="auto" w:fill="FFFFFF"/>
-          <w:lang w:val="en-US"/>
         </w:rPr>
         <w:t>.</w:t>
       </w:r>
@@ -2872,7 +2925,7 @@
     <w:p>
       <w:pPr>
         <w:rPr>
-          <w:rStyle w:val="Strong"/>
+          <w:rStyle w:val="af9"/>
           <w:rFonts w:cs="Times New Roman"/>
           <w:b w:val="0"/>
           <w:bCs w:val="0"/>
@@ -2882,7 +2935,7 @@
       </w:pPr>
       <w:r>
         <w:rPr>
-          <w:rStyle w:val="Strong"/>
+          <w:rStyle w:val="af9"/>
           <w:rFonts w:cs="Times New Roman"/>
           <w:b w:val="0"/>
           <w:bCs w:val="0"/>
@@ -2893,7 +2946,7 @@
       </w:r>
       <w:r>
         <w:rPr>
-          <w:rStyle w:val="Strong"/>
+          <w:rStyle w:val="af9"/>
           <w:rFonts w:cs="Times New Roman"/>
           <w:b w:val="0"/>
           <w:bCs w:val="0"/>
@@ -2904,7 +2957,7 @@
       </w:r>
       <w:r>
         <w:rPr>
-          <w:rStyle w:val="Strong"/>
+          <w:rStyle w:val="af9"/>
           <w:rFonts w:cs="Times New Roman"/>
           <w:b w:val="0"/>
           <w:bCs w:val="0"/>
@@ -2917,7 +2970,7 @@
     <w:p>
       <w:pPr>
         <w:rPr>
-          <w:rStyle w:val="Strong"/>
+          <w:rStyle w:val="af9"/>
           <w:rFonts w:cs="Times New Roman"/>
           <w:b w:val="0"/>
           <w:bCs w:val="0"/>
@@ -2927,7 +2980,7 @@
       </w:pPr>
       <w:r>
         <w:rPr>
-          <w:rStyle w:val="Strong"/>
+          <w:rStyle w:val="af9"/>
           <w:rFonts w:cs="Times New Roman"/>
           <w:b w:val="0"/>
           <w:bCs w:val="0"/>
@@ -2939,7 +2992,7 @@
       </w:r>
       <w:r>
         <w:rPr>
-          <w:rStyle w:val="Strong"/>
+          <w:rStyle w:val="af9"/>
           <w:rFonts w:cs="Times New Roman"/>
           <w:b w:val="0"/>
           <w:bCs w:val="0"/>
@@ -2950,124 +3003,233 @@
       </w:r>
       <w:r>
         <w:rPr>
-          <w:rStyle w:val="Strong"/>
+          <w:rStyle w:val="af9"/>
           <w:rFonts w:cs="Times New Roman"/>
           <w:b w:val="0"/>
           <w:bCs w:val="0"/>
           <w:color w:val="001D35"/>
           <w:shd w:val="clear" w:color="auto" w:fill="FFFFFF"/>
-          <w:lang w:val="en-US"/>
-        </w:rPr>
-        <w:t>(C</w:t>
-      </w:r>
-      <w:r>
-        <w:rPr>
-          <w:rStyle w:val="Strong"/>
+        </w:rPr>
+        <w:t>(</w:t>
+      </w:r>
+      <w:r>
+        <w:rPr>
+          <w:rStyle w:val="af9"/>
           <w:rFonts w:cs="Times New Roman"/>
           <w:b w:val="0"/>
           <w:bCs w:val="0"/>
           <w:color w:val="001D35"/>
           <w:shd w:val="clear" w:color="auto" w:fill="FFFFFF"/>
-        </w:rPr>
-        <w:t xml:space="preserve"> * </w:t>
-      </w:r>
-      <w:r>
-        <w:rPr>
-          <w:rStyle w:val="Strong"/>
+          <w:lang w:val="en-US"/>
+        </w:rPr>
+        <w:t>C</w:t>
+      </w:r>
+      <w:r>
+        <w:rPr>
+          <w:rStyle w:val="af9"/>
           <w:rFonts w:cs="Times New Roman"/>
           <w:b w:val="0"/>
           <w:bCs w:val="0"/>
           <w:color w:val="001D35"/>
           <w:shd w:val="clear" w:color="auto" w:fill="FFFFFF"/>
+        </w:rPr>
+        <w:t xml:space="preserve"> * </w:t>
+      </w:r>
+      <w:r>
+        <w:rPr>
+          <w:rStyle w:val="af9"/>
+          <w:rFonts w:cs="Times New Roman"/>
+          <w:b w:val="0"/>
+          <w:bCs w:val="0"/>
+          <w:color w:val="001D35"/>
+          <w:shd w:val="clear" w:color="auto" w:fill="FFFFFF"/>
           <w:lang w:val="en-US"/>
         </w:rPr>
         <w:t>P</w:t>
       </w:r>
       <w:r>
         <w:rPr>
-          <w:rStyle w:val="Strong"/>
+          <w:rStyle w:val="af9"/>
           <w:rFonts w:cs="Times New Roman"/>
           <w:b w:val="0"/>
           <w:bCs w:val="0"/>
           <w:color w:val="001D35"/>
           <w:shd w:val="clear" w:color="auto" w:fill="FFFFFF"/>
           <w:vertAlign w:val="superscript"/>
-          <w:lang w:val="en-US"/>
         </w:rPr>
         <w:t>-1</w:t>
       </w:r>
       <w:r>
         <w:rPr>
-          <w:rStyle w:val="Strong"/>
+          <w:rStyle w:val="af9"/>
           <w:rFonts w:cs="Times New Roman"/>
           <w:b w:val="0"/>
           <w:bCs w:val="0"/>
           <w:color w:val="001D35"/>
           <w:shd w:val="clear" w:color="auto" w:fill="FFFFFF"/>
-          <w:lang w:val="en-US"/>
-        </w:rPr>
-        <w:t>) mod 37</w:t>
-      </w:r>
-    </w:p>
-    <w:p>
-      <w:pPr>
-        <w:rPr>
-          <w:rStyle w:val="Strong"/>
+        </w:rPr>
+        <w:t xml:space="preserve">) </w:t>
+      </w:r>
+      <w:r>
+        <w:rPr>
+          <w:rStyle w:val="af9"/>
           <w:rFonts w:cs="Times New Roman"/>
           <w:b w:val="0"/>
           <w:bCs w:val="0"/>
           <w:color w:val="001D35"/>
           <w:shd w:val="clear" w:color="auto" w:fill="FFFFFF"/>
-        </w:rPr>
-      </w:pPr>
-    </w:p>
-    <w:p>
-      <w:pPr>
-        <w:rPr>
-          <w:rStyle w:val="Strong"/>
+          <w:lang w:val="en-US"/>
+        </w:rPr>
+        <w:t>mod</w:t>
+      </w:r>
+      <w:r>
+        <w:rPr>
+          <w:rStyle w:val="af9"/>
           <w:rFonts w:cs="Times New Roman"/>
           <w:b w:val="0"/>
           <w:bCs w:val="0"/>
           <w:color w:val="001D35"/>
           <w:shd w:val="clear" w:color="auto" w:fill="FFFFFF"/>
         </w:rPr>
-      </w:pPr>
-    </w:p>
-    <w:p>
-      <w:pPr>
-        <w:pStyle w:val="Heading3"/>
+        <w:t xml:space="preserve"> 37</w:t>
+      </w:r>
+    </w:p>
+    <w:p>
+      <w:pPr>
+        <w:rPr>
+          <w:rStyle w:val="af9"/>
+          <w:rFonts w:cs="Times New Roman"/>
+          <w:b w:val="0"/>
+          <w:bCs w:val="0"/>
+          <w:color w:val="001D35"/>
+          <w:shd w:val="clear" w:color="auto" w:fill="FFFFFF"/>
+        </w:rPr>
+      </w:pPr>
+    </w:p>
+    <w:p>
+      <w:pPr>
+        <w:rPr>
+          <w:rStyle w:val="af9"/>
+          <w:rFonts w:cs="Times New Roman"/>
+          <w:b w:val="0"/>
+          <w:bCs w:val="0"/>
+          <w:color w:val="001D35"/>
+          <w:shd w:val="clear" w:color="auto" w:fill="FFFFFF"/>
+        </w:rPr>
+      </w:pPr>
+    </w:p>
+    <w:p>
+      <w:pPr>
+        <w:pStyle w:val="3"/>
         <w:jc w:val="center"/>
         <w:rPr>
+          <w:b/>
+          <w:bCs/>
           <w:shd w:val="clear" w:color="auto" w:fill="FFFFFF"/>
         </w:rPr>
       </w:pPr>
       <w:r>
         <w:rPr>
+          <w:b/>
+          <w:bCs/>
           <w:shd w:val="clear" w:color="auto" w:fill="FFFFFF"/>
         </w:rPr>
         <w:lastRenderedPageBreak/>
-        <w:t>4</w:t>
-      </w:r>
-      <w:r>
-        <w:rPr>
-          <w:shd w:val="clear" w:color="auto" w:fill="FFFFFF"/>
-          <w:lang w:val="en-US"/>
-        </w:rPr>
+        <w:t>4. Доказательство корректности алгоритма</w:t>
+      </w:r>
+    </w:p>
+    <w:p>
+      <w:r>
+        <w:t xml:space="preserve">1. </w:t>
+      </w:r>
+      <w:r>
+        <w:t xml:space="preserve">Рассмотрим два блока открытого текста </w:t>
+      </w:r>
+      <w:r>
+        <w:rPr>
+          <w:lang w:val="en-US"/>
+        </w:rPr>
+        <w:t>P</w:t>
+      </w:r>
+      <w:r>
+        <w:rPr>
+          <w:vertAlign w:val="subscript"/>
+        </w:rPr>
+        <w:t>1</w:t>
+      </w:r>
+      <w:r>
+        <w:t xml:space="preserve"> </w:t>
+      </w:r>
+      <w:r>
+        <w:t xml:space="preserve">и </w:t>
+      </w:r>
+      <w:r>
+        <w:rPr>
+          <w:lang w:val="en-US"/>
+        </w:rPr>
+        <w:t>P</w:t>
+      </w:r>
+      <w:r>
+        <w:rPr>
+          <w:vertAlign w:val="subscript"/>
+        </w:rPr>
+        <w:t>2</w:t>
+      </w:r>
+      <w:r>
+        <w:t xml:space="preserve"> </w:t>
+      </w:r>
+      <w:r>
+        <w:t xml:space="preserve">и соответствующие им блоки зашифрованного текста </w:t>
+      </w:r>
+      <w:r>
+        <w:rPr>
+          <w:lang w:val="en-US"/>
+        </w:rPr>
+        <w:t>C</w:t>
+      </w:r>
+      <w:r>
+        <w:rPr>
+          <w:vertAlign w:val="subscript"/>
+        </w:rPr>
+        <w:t>1</w:t>
+      </w:r>
+      <w:r>
+        <w:t xml:space="preserve"> </w:t>
+      </w:r>
+      <w:r>
+        <w:t xml:space="preserve">и </w:t>
+      </w:r>
+      <w:r>
+        <w:rPr>
+          <w:lang w:val="en-US"/>
+        </w:rPr>
+        <w:t>C</w:t>
+      </w:r>
+      <w:r>
+        <w:rPr>
+          <w:vertAlign w:val="subscript"/>
+        </w:rPr>
+        <w:t>2</w:t>
+      </w:r>
+      <w:r>
         <w:t xml:space="preserve">. </w:t>
       </w:r>
-      <w:r>
-        <w:rPr>
-          <w:shd w:val="clear" w:color="auto" w:fill="FFFFFF"/>
-        </w:rPr>
-        <w:t>Доказательство корректности алгоритма</w:t>
-      </w:r>
-    </w:p>
-    <w:p>
-      <w:r>
-        <w:t xml:space="preserve">1. </w:t>
-      </w:r>
-      <w:r>
-        <w:t xml:space="preserve">Рассмотрим два блока открытого текста </w:t>
+    </w:p>
+    <w:p>
+      <w:r>
+        <w:t xml:space="preserve">Объединим их в матрицы </w:t>
+      </w:r>
+      <w:r>
+        <w:rPr>
+          <w:lang w:val="en-US"/>
+        </w:rPr>
+        <w:t>C</w:t>
+      </w:r>
+      <w:r>
+        <w:t xml:space="preserve"> </w:t>
+      </w:r>
+      <w:r>
+        <w:t xml:space="preserve">и </w:t>
       </w:r>
       <w:r>
         <w:rPr>
@@ -3075,17 +3237,176 @@
         </w:rPr>
         <w:t>P</w:t>
       </w:r>
+    </w:p>
+    <w:p>
+      <w:pPr>
+        <w:rPr>
+          <w:lang w:val="en-US"/>
+        </w:rPr>
+      </w:pPr>
+      <w:r>
+        <w:rPr>
+          <w:lang w:val="en-US"/>
+        </w:rPr>
+        <w:t>C = [C</w:t>
+      </w:r>
       <w:r>
         <w:rPr>
           <w:vertAlign w:val="subscript"/>
+          <w:lang w:val="en-US"/>
         </w:rPr>
         <w:t>1</w:t>
       </w:r>
       <w:r>
+        <w:rPr>
+          <w:lang w:val="en-US"/>
+        </w:rPr>
+        <w:t>, C</w:t>
+      </w:r>
+      <w:r>
+        <w:rPr>
+          <w:vertAlign w:val="subscript"/>
+          <w:lang w:val="en-US"/>
+        </w:rPr>
+        <w:t>2</w:t>
+      </w:r>
+      <w:r>
+        <w:rPr>
+          <w:lang w:val="en-US"/>
+        </w:rPr>
+        <w:t>]</w:t>
+      </w:r>
+    </w:p>
+    <w:p>
+      <w:pPr>
+        <w:rPr>
+          <w:lang w:val="en-US"/>
+        </w:rPr>
+      </w:pPr>
+      <w:r>
+        <w:rPr>
+          <w:lang w:val="en-US"/>
+        </w:rPr>
+        <w:t>P = [P</w:t>
+      </w:r>
+      <w:r>
+        <w:rPr>
+          <w:vertAlign w:val="subscript"/>
+          <w:lang w:val="en-US"/>
+        </w:rPr>
+        <w:t>1</w:t>
+      </w:r>
+      <w:r>
+        <w:rPr>
+          <w:lang w:val="en-US"/>
+        </w:rPr>
+        <w:t>, P</w:t>
+      </w:r>
+      <w:r>
+        <w:rPr>
+          <w:vertAlign w:val="subscript"/>
+          <w:lang w:val="en-US"/>
+        </w:rPr>
+        <w:t>2</w:t>
+      </w:r>
+      <w:r>
+        <w:rPr>
+          <w:lang w:val="en-US"/>
+        </w:rPr>
+        <w:t>]</w:t>
+      </w:r>
+    </w:p>
+    <w:p>
+      <w:pPr>
+        <w:rPr>
+          <w:lang w:val="en-US"/>
+        </w:rPr>
+      </w:pPr>
+      <w:r>
+        <w:rPr>
+          <w:lang w:val="en-US"/>
+        </w:rPr>
+        <w:t>C</w:t>
+      </w:r>
+      <w:r>
+        <w:rPr>
+          <w:lang w:val="en-US"/>
+        </w:rPr>
+        <w:t xml:space="preserve"> = (</w:t>
+      </w:r>
+      <w:r>
+        <w:rPr>
+          <w:lang w:val="en-US"/>
+        </w:rPr>
+        <w:t>K</w:t>
+      </w:r>
+      <w:r>
+        <w:rPr>
+          <w:lang w:val="en-US"/>
+        </w:rPr>
+        <w:t>*</w:t>
+      </w:r>
+      <w:r>
+        <w:rPr>
+          <w:lang w:val="en-US"/>
+        </w:rPr>
+        <w:t>P</w:t>
+      </w:r>
+      <w:r>
+        <w:rPr>
+          <w:lang w:val="en-US"/>
+        </w:rPr>
+        <w:t xml:space="preserve">) </w:t>
+      </w:r>
+      <w:r>
+        <w:rPr>
+          <w:lang w:val="en-US"/>
+        </w:rPr>
+        <w:t>mod</w:t>
+      </w:r>
+      <w:r>
+        <w:rPr>
+          <w:lang w:val="en-US"/>
+        </w:rPr>
+        <w:t>(37)</w:t>
+      </w:r>
+      <w:r>
+        <w:rPr>
+          <w:lang w:val="en-US"/>
+        </w:rPr>
+        <w:t xml:space="preserve">   (1)</w:t>
+      </w:r>
+    </w:p>
+    <w:p>
+      <w:pPr>
+        <w:rPr>
+          <w:lang w:val="en-US"/>
+        </w:rPr>
+      </w:pPr>
+    </w:p>
+    <w:p>
+      <w:r>
+        <w:t xml:space="preserve">2. </w:t>
+      </w:r>
+      <w:r>
+        <w:t>Если</w:t>
+      </w:r>
+      <w:r>
         <w:t xml:space="preserve"> </w:t>
       </w:r>
-      <w:r>
-        <w:t xml:space="preserve">и </w:t>
+      <w:proofErr w:type="gramStart"/>
+      <w:r>
+        <w:t>НОД(</w:t>
+      </w:r>
+      <w:proofErr w:type="gramEnd"/>
+      <w:r>
+        <w:rPr>
+          <w:lang w:val="en-US"/>
+        </w:rPr>
+        <w:t>det</w:t>
+      </w:r>
+      <w:r>
+        <w:t xml:space="preserve"> </w:t>
       </w:r>
       <w:r>
         <w:rPr>
@@ -3094,425 +3415,843 @@
         <w:t>P</w:t>
       </w:r>
       <w:r>
+        <w:t xml:space="preserve">, </w:t>
+      </w:r>
+      <w:r>
+        <w:rPr>
+          <w:lang w:val="en-US"/>
+        </w:rPr>
+        <w:t>n</w:t>
+      </w:r>
+      <w:r>
+        <w:t>)</w:t>
+      </w:r>
+      <w:r>
+        <w:t xml:space="preserve"> = 1, </w:t>
+      </w:r>
+      <w:r>
+        <w:t xml:space="preserve">то матрица </w:t>
+      </w:r>
+      <w:r>
+        <w:rPr>
+          <w:lang w:val="en-US"/>
+        </w:rPr>
+        <w:t>P</w:t>
+      </w:r>
+      <w:r>
+        <w:t xml:space="preserve"> </w:t>
+      </w:r>
+      <w:r>
+        <w:t xml:space="preserve">обратима </w:t>
+      </w:r>
+      <w:r>
+        <w:t xml:space="preserve">-&gt; </w:t>
+      </w:r>
+      <w:r>
+        <w:t xml:space="preserve">существует </w:t>
+      </w:r>
+      <w:r>
+        <w:rPr>
+          <w:lang w:val="en-US"/>
+        </w:rPr>
+        <w:t>P</w:t>
+      </w:r>
+      <w:r>
+        <w:rPr>
+          <w:vertAlign w:val="superscript"/>
+        </w:rPr>
+        <w:t>-1</w:t>
+      </w:r>
+      <w:r>
+        <w:t>.</w:t>
+      </w:r>
+      <w:r>
+        <w:t xml:space="preserve"> </w:t>
+      </w:r>
+    </w:p>
+    <w:p>
+      <w:r>
+        <w:t>Важна также линейная независимость</w:t>
+      </w:r>
+      <w:r>
+        <w:t xml:space="preserve">, </w:t>
+      </w:r>
+      <w:r>
+        <w:t>иначе матрицу нельзя обратить</w:t>
+      </w:r>
+      <w:r>
+        <w:t>.</w:t>
+      </w:r>
+    </w:p>
+    <w:p>
+      <w:r>
+        <w:t>В случае невыполнения любого из пунктов, необходимо</w:t>
+      </w:r>
+      <w:r>
+        <w:t xml:space="preserve"> выбрать другие блоки</w:t>
+      </w:r>
+      <w:r>
+        <w:t>.</w:t>
+      </w:r>
+    </w:p>
+    <w:p/>
+    <w:p>
+      <w:r>
+        <w:t>3</w:t>
+      </w:r>
+      <w:r>
+        <w:t xml:space="preserve">. </w:t>
+      </w:r>
+      <w:r>
+        <w:t xml:space="preserve">Преобразуем </w:t>
+      </w:r>
+      <w:r>
+        <w:t>(1)</w:t>
+      </w:r>
+    </w:p>
+    <w:p>
+      <w:r>
+        <w:rPr>
+          <w:lang w:val="en-US"/>
+        </w:rPr>
+        <w:t>C</w:t>
+      </w:r>
+      <w:r>
+        <w:t xml:space="preserve"> * </w:t>
+      </w:r>
+      <w:r>
+        <w:rPr>
+          <w:lang w:val="en-US"/>
+        </w:rPr>
+        <w:t>P</w:t>
+      </w:r>
+      <w:r>
+        <w:rPr>
+          <w:vertAlign w:val="superscript"/>
+        </w:rPr>
+        <w:t>-1</w:t>
+      </w:r>
+      <w:r>
+        <w:t xml:space="preserve"> = </w:t>
+      </w:r>
+      <w:r>
+        <w:rPr>
+          <w:lang w:val="en-US"/>
+        </w:rPr>
+        <w:t>K</w:t>
+      </w:r>
+      <w:r>
+        <w:t xml:space="preserve"> * </w:t>
+      </w:r>
+      <w:r>
+        <w:rPr>
+          <w:lang w:val="en-US"/>
+        </w:rPr>
+        <w:t>I</w:t>
+      </w:r>
+      <w:r>
+        <w:t xml:space="preserve"> = </w:t>
+      </w:r>
+      <w:r>
+        <w:rPr>
+          <w:lang w:val="en-US"/>
+        </w:rPr>
+        <w:t>K</w:t>
+      </w:r>
+    </w:p>
+    <w:p>
+      <w:r>
+        <w:rPr>
+          <w:lang w:val="en-US"/>
+        </w:rPr>
+        <w:t>K</w:t>
+      </w:r>
+      <w:r>
+        <w:t xml:space="preserve"> </w:t>
+      </w:r>
+      <w:r>
+        <w:t>найден</w:t>
+      </w:r>
+      <w:r>
+        <w:t>.</w:t>
+      </w:r>
+    </w:p>
+    <w:p/>
+    <w:p>
+      <w:pPr>
+        <w:pStyle w:val="3"/>
+        <w:jc w:val="center"/>
+      </w:pPr>
+      <w:r>
+        <w:t>5</w:t>
+      </w:r>
+      <w:r>
+        <w:t>.</w:t>
+      </w:r>
+      <w:r>
+        <w:t xml:space="preserve"> </w:t>
+      </w:r>
+      <w:r>
+        <w:rPr>
+          <w:b/>
+          <w:bCs/>
+        </w:rPr>
+        <w:t>Пример</w:t>
+      </w:r>
+    </w:p>
+    <w:p>
+      <w:pPr>
+        <w:rPr>
+          <w:b/>
+          <w:bCs/>
+          <w:lang w:val="en-US"/>
+        </w:rPr>
+      </w:pPr>
+      <w:r>
+        <w:rPr>
+          <w:b/>
+          <w:bCs/>
+        </w:rPr>
+        <w:t>Входные данные</w:t>
+      </w:r>
+      <w:r>
+        <w:rPr>
+          <w:b/>
+          <w:bCs/>
+          <w:lang w:val="en-US"/>
+        </w:rPr>
+        <w:t>:</w:t>
+      </w:r>
+    </w:p>
+    <w:p>
+      <w:r>
+        <w:t xml:space="preserve">Открытый текст1 = </w:t>
+      </w:r>
+      <w:r>
+        <w:t>СЕССИЯ</w:t>
+      </w:r>
+      <w:r>
+        <w:rPr>
+          <w:rFonts w:ascii="MS Gothic" w:eastAsia="MS Gothic" w:hAnsi="MS Gothic" w:cs="MS Gothic" w:hint="eastAsia"/>
+        </w:rPr>
+        <w:t>␣</w:t>
+      </w:r>
+      <w:r>
+        <w:t>СКОРО</w:t>
+      </w:r>
+    </w:p>
+    <w:p>
+      <w:r>
+        <w:t>Зашифрованный</w:t>
+      </w:r>
+      <w:r>
+        <w:t xml:space="preserve"> текст1</w:t>
+      </w:r>
+      <w:r>
+        <w:t xml:space="preserve"> = </w:t>
+      </w:r>
+      <w:proofErr w:type="gramStart"/>
+      <w:r>
+        <w:t>У,ЕИВАЬР</w:t>
+      </w:r>
+      <w:proofErr w:type="gramEnd"/>
+      <w:r>
+        <w:t>?МЧЮ</w:t>
+      </w:r>
+    </w:p>
+    <w:p>
+      <w:pPr>
+        <w:rPr>
+          <w:lang w:val="en-US"/>
+        </w:rPr>
+      </w:pPr>
+      <w:r>
+        <w:t>Зашифрованный текст2</w:t>
+      </w:r>
+      <w:r>
+        <w:rPr>
+          <w:lang w:val="en-US"/>
+        </w:rPr>
+        <w:t xml:space="preserve"> = </w:t>
+      </w:r>
+      <w:r>
+        <w:rPr>
+          <w:lang w:val="en-US"/>
+        </w:rPr>
+        <w:t>ЩО!?ЭЙШ.ЛИЯЯ</w:t>
+      </w:r>
+    </w:p>
+    <w:p>
+      <w:pPr>
+        <w:rPr>
+          <w:b/>
+          <w:bCs/>
+        </w:rPr>
+      </w:pPr>
+    </w:p>
+    <w:p>
+      <w:pPr>
+        <w:ind w:firstLine="708"/>
+        <w:rPr>
+          <w:b/>
+          <w:bCs/>
+          <w:lang w:val="en-US"/>
+        </w:rPr>
+      </w:pPr>
+      <w:r>
+        <w:rPr>
+          <w:b/>
+          <w:bCs/>
+        </w:rPr>
+        <w:lastRenderedPageBreak/>
+        <w:t>Необходимо</w:t>
+      </w:r>
+      <w:r>
+        <w:rPr>
+          <w:b/>
+          <w:bCs/>
+          <w:lang w:val="en-US"/>
+        </w:rPr>
+        <w:t>:</w:t>
+      </w:r>
+    </w:p>
+    <w:p>
+      <w:r>
+        <w:t>Найти ключ</w:t>
+      </w:r>
+      <w:r>
+        <w:rPr>
+          <w:lang w:val="en-US"/>
+        </w:rPr>
+        <w:t xml:space="preserve">, </w:t>
+      </w:r>
+      <w:r>
+        <w:t>расшифровать текст2</w:t>
+      </w:r>
+    </w:p>
+    <w:p>
+      <w:pPr>
+        <w:rPr>
+          <w:b/>
+          <w:bCs/>
+          <w:lang w:val="en-US"/>
+        </w:rPr>
+      </w:pPr>
+      <w:r>
+        <w:rPr>
+          <w:b/>
+          <w:bCs/>
+        </w:rPr>
+        <w:t>Решение</w:t>
+      </w:r>
+      <w:r>
+        <w:rPr>
+          <w:b/>
+          <w:bCs/>
+          <w:lang w:val="en-US"/>
+        </w:rPr>
+        <w:t>:</w:t>
+      </w:r>
+    </w:p>
+    <w:p>
+      <w:r>
+        <w:t>Разбиваем открытый и зашифрованный тексты на блоки</w:t>
+      </w:r>
+      <w:r>
+        <w:t>.</w:t>
+      </w:r>
+    </w:p>
+    <w:p>
+      <w:pPr>
+        <w:rPr>
+          <w:lang w:val="en-US"/>
+        </w:rPr>
+      </w:pPr>
+      <w:r>
+        <w:rPr>
+          <w:lang w:val="en-US"/>
+        </w:rPr>
+        <w:t>P = [17 17  8  32 10 16</w:t>
+      </w:r>
+    </w:p>
+    <w:p>
+      <w:pPr>
+        <w:rPr>
+          <w:lang w:val="en-US"/>
+        </w:rPr>
+      </w:pPr>
+      <w:r>
+        <w:rPr>
+          <w:lang w:val="en-US"/>
+        </w:rPr>
+        <w:t xml:space="preserve">        5   17 31 17 14 14]</w:t>
+      </w:r>
+    </w:p>
+    <w:p>
+      <w:pPr>
+        <w:rPr>
+          <w:lang w:val="en-US"/>
+        </w:rPr>
+      </w:pPr>
+      <w:r>
+        <w:rPr>
+          <w:lang w:val="en-US"/>
+        </w:rPr>
+        <w:t xml:space="preserve">C = </w:t>
+      </w:r>
+      <w:r>
+        <w:rPr>
+          <w:lang w:val="en-US"/>
+        </w:rPr>
+        <w:t xml:space="preserve"> [19 5  2 28 36 23</w:t>
+      </w:r>
+    </w:p>
+    <w:p>
+      <w:pPr>
+        <w:rPr>
+          <w:lang w:val="en-US"/>
+        </w:rPr>
+      </w:pPr>
+      <w:r>
+        <w:rPr>
+          <w:lang w:val="en-US"/>
+        </w:rPr>
+        <w:t xml:space="preserve">         34  8 0 16 12 30]</w:t>
+      </w:r>
+    </w:p>
+    <w:p>
+      <w:pPr>
+        <w:rPr>
+          <w:lang w:val="en-US"/>
+        </w:rPr>
+      </w:pPr>
+    </w:p>
+    <w:p>
+      <w:r>
+        <w:t>Возьмём первые два столбца матрицы P:</w:t>
+      </w:r>
+    </w:p>
+    <w:p>
+      <w:r>
+        <w:t xml:space="preserve">P₀ </w:t>
+      </w:r>
+      <w:proofErr w:type="gramStart"/>
+      <w:r>
+        <w:t>=[ 17</w:t>
+      </w:r>
+      <w:proofErr w:type="gramEnd"/>
+      <w:r>
+        <w:t xml:space="preserve"> 17</w:t>
+      </w:r>
+      <w:r>
+        <w:br/>
+      </w:r>
+      <w:r>
+        <w:t xml:space="preserve">         </w:t>
+      </w:r>
+      <w:r>
+        <w:t>5 17 ]</w:t>
+      </w:r>
+    </w:p>
+    <w:p>
+      <w:r>
+        <w:t>Вычислим определитель:</w:t>
+      </w:r>
+    </w:p>
+    <w:p>
+      <w:proofErr w:type="spellStart"/>
+      <w:r>
+        <w:t>det</w:t>
+      </w:r>
+      <w:proofErr w:type="spellEnd"/>
+      <w:r>
+        <w:t>(P₀) = 17·17 − 5·17 = 289 − 85 = 204 ≡ 19 (</w:t>
+      </w:r>
+      <w:proofErr w:type="spellStart"/>
+      <w:r>
+        <w:t>mod</w:t>
+      </w:r>
+      <w:proofErr w:type="spellEnd"/>
+      <w:r>
+        <w:t xml:space="preserve"> 37)</w:t>
+      </w:r>
+    </w:p>
+    <w:p>
+      <w:r>
+        <w:t xml:space="preserve">Так как </w:t>
+      </w:r>
+      <w:proofErr w:type="gramStart"/>
+      <w:r>
+        <w:t>НОД</w:t>
+      </w:r>
+      <w:r>
+        <w:t>(</w:t>
+      </w:r>
+      <w:proofErr w:type="gramEnd"/>
+      <w:r>
+        <w:t>19, 37) = 1, матрица обратима по модулю 37.</w:t>
+      </w:r>
+    </w:p>
+    <w:p/>
+    <w:p>
+      <w:r>
+        <w:t>Найдём обратный элемент к 19 по модулю 37:</w:t>
+      </w:r>
+    </w:p>
+    <w:p>
+      <w:r>
+        <w:t xml:space="preserve">19⁻¹ </w:t>
+      </w:r>
+      <w:r>
+        <w:t>=</w:t>
+      </w:r>
+      <w:r>
+        <w:t xml:space="preserve"> 2 (</w:t>
+      </w:r>
+      <w:proofErr w:type="spellStart"/>
+      <w:r>
+        <w:t>mod</w:t>
+      </w:r>
+      <w:proofErr w:type="spellEnd"/>
+      <w:r>
+        <w:t xml:space="preserve"> 37</w:t>
+      </w:r>
+      <w:r>
+        <w:t>)</w:t>
+      </w:r>
+    </w:p>
+    <w:p>
+      <w:r>
+        <w:t>Тогда:</w:t>
+      </w:r>
+    </w:p>
+    <w:p>
+      <w:r>
+        <w:t>P₀⁻¹ = 2 ·</w:t>
+      </w:r>
+      <w:r>
+        <w:br/>
+        <w:t>[ 17 −17</w:t>
+      </w:r>
+      <w:r>
+        <w:br/>
+        <w:t xml:space="preserve">−5 </w:t>
+      </w:r>
+      <w:proofErr w:type="gramStart"/>
+      <w:r>
+        <w:t>17 ]</w:t>
+      </w:r>
+      <w:proofErr w:type="gramEnd"/>
+      <w:r>
+        <w:t xml:space="preserve"> (</w:t>
+      </w:r>
+      <w:proofErr w:type="spellStart"/>
+      <w:r>
+        <w:t>mod</w:t>
+      </w:r>
+      <w:proofErr w:type="spellEnd"/>
+      <w:r>
+        <w:t xml:space="preserve"> 37)</w:t>
+      </w:r>
+    </w:p>
+    <w:p>
+      <w:r>
+        <w:t>После приведения по модулю 37:</w:t>
+      </w:r>
+    </w:p>
+    <w:p>
+      <w:r>
+        <w:lastRenderedPageBreak/>
+        <w:t xml:space="preserve">P₀⁻¹ </w:t>
+      </w:r>
+      <w:proofErr w:type="gramStart"/>
+      <w:r>
+        <w:t>=[ 34</w:t>
+      </w:r>
+      <w:proofErr w:type="gramEnd"/>
+      <w:r>
+        <w:t xml:space="preserve"> 3</w:t>
+      </w:r>
+      <w:r>
+        <w:br/>
+      </w:r>
+      <w:r>
+        <w:rPr>
+          <w:lang w:val="en-US"/>
+        </w:rPr>
+        <w:t xml:space="preserve">            </w:t>
+      </w:r>
+      <w:r>
+        <w:t>27 34 ]</w:t>
+      </w:r>
+    </w:p>
+    <w:p/>
+    <w:p>
+      <w:pPr>
+        <w:rPr>
+          <w:lang w:val="en-US"/>
+        </w:rPr>
+      </w:pPr>
+      <w:r>
+        <w:rPr>
+          <w:lang w:val="en-US"/>
+        </w:rPr>
+        <w:t xml:space="preserve">K = </w:t>
+      </w:r>
+      <w:r>
+        <w:rPr>
+          <w:lang w:val="en-US"/>
+        </w:rPr>
+        <w:t>(</w:t>
+      </w:r>
+      <w:r>
+        <w:t>С</w:t>
+      </w:r>
+      <w:r>
         <w:rPr>
           <w:vertAlign w:val="subscript"/>
         </w:rPr>
-        <w:t>2</w:t>
+        <w:t>0</w:t>
+      </w:r>
+      <w:r>
+        <w:t xml:space="preserve"> * </w:t>
+      </w:r>
+      <w:r>
+        <w:rPr>
+          <w:lang w:val="en-US"/>
+        </w:rPr>
+        <w:t>P</w:t>
+      </w:r>
+      <w:r>
+        <w:rPr>
+          <w:vertAlign w:val="subscript"/>
+        </w:rPr>
+        <w:t>0</w:t>
+      </w:r>
+      <w:r>
+        <w:rPr>
+          <w:vertAlign w:val="superscript"/>
+          <w:lang w:val="en-US"/>
+        </w:rPr>
+        <w:t>-1</w:t>
+      </w:r>
+      <w:r>
+        <w:rPr>
+          <w:lang w:val="en-US"/>
+        </w:rPr>
+        <w:t>) mod 37</w:t>
+      </w:r>
+    </w:p>
+    <w:p>
+      <w:pPr>
+        <w:rPr>
+          <w:lang w:val="en-US"/>
+        </w:rPr>
+      </w:pPr>
+      <w:r>
+        <w:rPr>
+          <w:lang w:val="en-US"/>
+        </w:rPr>
+        <w:t>K = [4 5</w:t>
+      </w:r>
+    </w:p>
+    <w:p>
+      <w:r>
+        <w:rPr>
+          <w:lang w:val="en-US"/>
+        </w:rPr>
+        <w:t xml:space="preserve">         3 4]</w:t>
+      </w:r>
+    </w:p>
+    <w:p/>
+    <w:p>
+      <w:pPr>
+        <w:rPr>
+          <w:lang w:val="en-US"/>
+        </w:rPr>
+      </w:pPr>
+      <w:r>
+        <w:t>Используя ключ, расшифруем второй текст, получим</w:t>
+      </w:r>
+      <w:r>
+        <w:t>:</w:t>
+      </w:r>
+    </w:p>
+    <w:p>
+      <w:r>
+        <w:rPr>
+          <w:lang w:val="en-US"/>
+        </w:rPr>
+        <w:t>ПРИВЕТ,</w:t>
+      </w:r>
+      <w:r>
+        <w:rPr>
+          <w:rFonts w:ascii="MS Gothic" w:eastAsia="MS Gothic" w:hAnsi="MS Gothic" w:cs="MS Gothic" w:hint="eastAsia"/>
+          <w:lang w:val="en-US"/>
+        </w:rPr>
+        <w:t>␣</w:t>
+      </w:r>
+      <w:r>
+        <w:rPr>
+          <w:rFonts w:cs="Times New Roman"/>
+          <w:lang w:val="en-US"/>
+        </w:rPr>
+        <w:t>МИР</w:t>
+      </w:r>
+      <w:r>
+        <w:rPr>
+          <w:lang w:val="en-US"/>
+        </w:rPr>
+        <w:t>!</w:t>
+      </w:r>
+    </w:p>
+    <w:p/>
+    <w:p>
+      <w:pPr>
+        <w:pStyle w:val="3"/>
+        <w:jc w:val="center"/>
+        <w:rPr>
+          <w:b/>
+          <w:bCs/>
+        </w:rPr>
+      </w:pPr>
+      <w:r>
+        <w:rPr>
+          <w:b/>
+          <w:bCs/>
+        </w:rPr>
+        <w:t xml:space="preserve">6. </w:t>
+      </w:r>
+      <w:r>
+        <w:rPr>
+          <w:b/>
+          <w:bCs/>
+        </w:rPr>
+        <w:t>Код</w:t>
+      </w:r>
+    </w:p>
+    <w:p>
+      <w:pPr>
+        <w:ind w:firstLine="709"/>
+        <w:jc w:val="both"/>
+      </w:pPr>
+      <w:r>
+        <w:t>Исходный код</w:t>
+      </w:r>
+      <w:r>
+        <w:t xml:space="preserve">, </w:t>
+      </w:r>
+      <w:r>
+        <w:t>выполняющий шифровку и расшифровку кода Хилла, а также подбирающий ключ,</w:t>
+      </w:r>
+      <w:r>
+        <w:t xml:space="preserve"> можно просмотреть на </w:t>
+      </w:r>
+      <w:proofErr w:type="spellStart"/>
+      <w:r>
+        <w:t>Git</w:t>
+      </w:r>
+      <w:proofErr w:type="spellEnd"/>
+      <w:r>
+        <w:rPr>
+          <w:lang w:val="en-US"/>
+        </w:rPr>
+        <w:t>hub</w:t>
+      </w:r>
+      <w:r>
+        <w:t xml:space="preserve"> [Электронный ресурс:</w:t>
       </w:r>
       <w:r>
         <w:t xml:space="preserve"> </w:t>
       </w:r>
-      <w:r>
-        <w:t xml:space="preserve">и соответствующие им блоки зашифрованного текста </w:t>
-      </w:r>
-      <w:r>
-        <w:rPr>
-          <w:lang w:val="en-US"/>
-        </w:rPr>
-        <w:t>C</w:t>
-      </w:r>
-      <w:r>
-        <w:rPr>
-          <w:vertAlign w:val="subscript"/>
-        </w:rPr>
-        <w:t>1</w:t>
+      <w:hyperlink r:id="rId8" w:history="1">
+        <w:r>
+          <w:rPr>
+            <w:rStyle w:val="af3"/>
+          </w:rPr>
+          <w:t>https://github.com/Miwm64/itmo_cse/</w:t>
+        </w:r>
+        <w:r>
+          <w:rPr>
+            <w:rStyle w:val="af3"/>
+          </w:rPr>
+          <w:t>t</w:t>
+        </w:r>
+        <w:r>
+          <w:rPr>
+            <w:rStyle w:val="af3"/>
+          </w:rPr>
+          <w:t>ree/master/</w:t>
+        </w:r>
+        <w:proofErr w:type="spellStart"/>
+        <w:r>
+          <w:rPr>
+            <w:rStyle w:val="af3"/>
+            <w:lang w:val="en-US"/>
+          </w:rPr>
+          <w:t>linal</w:t>
+        </w:r>
+        <w:proofErr w:type="spellEnd"/>
+        <w:r>
+          <w:rPr>
+            <w:rStyle w:val="af3"/>
+          </w:rPr>
+          <w:t>/</w:t>
+        </w:r>
+        <w:r>
+          <w:rPr>
+            <w:rStyle w:val="af3"/>
+            <w:lang w:val="en-US"/>
+          </w:rPr>
+          <w:t>project</w:t>
+        </w:r>
+        <w:r>
+          <w:rPr>
+            <w:rStyle w:val="af3"/>
+          </w:rPr>
+          <w:t>1</w:t>
+        </w:r>
+        <w:r>
+          <w:rPr>
+            <w:rStyle w:val="af3"/>
+          </w:rPr>
+          <w:t>.</w:t>
+        </w:r>
+        <w:proofErr w:type="spellStart"/>
+        <w:r>
+          <w:rPr>
+            <w:rStyle w:val="af3"/>
+            <w:lang w:val="en-US"/>
+          </w:rPr>
+          <w:t>py</w:t>
+        </w:r>
+        <w:proofErr w:type="spellEnd"/>
+      </w:hyperlink>
+      <w:r>
+        <w:t>,</w:t>
       </w:r>
       <w:r>
         <w:t xml:space="preserve"> </w:t>
       </w:r>
       <w:r>
-        <w:t xml:space="preserve">и </w:t>
-      </w:r>
-      <w:r>
-        <w:rPr>
-          <w:lang w:val="en-US"/>
-        </w:rPr>
-        <w:t>C</w:t>
-      </w:r>
-      <w:r>
-        <w:rPr>
-          <w:vertAlign w:val="subscript"/>
-        </w:rPr>
-        <w:t>2</w:t>
-      </w:r>
-      <w:r>
-        <w:t xml:space="preserve">. </w:t>
-      </w:r>
-    </w:p>
-    <w:p>
-      <w:r>
-        <w:t xml:space="preserve">Объединим их в матрицы </w:t>
-      </w:r>
-      <w:r>
-        <w:rPr>
-          <w:lang w:val="en-US"/>
-        </w:rPr>
-        <w:t>C</w:t>
-      </w:r>
-      <w:r>
-        <w:t xml:space="preserve"> </w:t>
-      </w:r>
-      <w:r>
-        <w:t xml:space="preserve">и </w:t>
-      </w:r>
-      <w:r>
-        <w:rPr>
-          <w:lang w:val="en-US"/>
-        </w:rPr>
-        <w:t>P</w:t>
-      </w:r>
-    </w:p>
-    <w:p>
-      <w:pPr>
-        <w:rPr>
-          <w:lang w:val="en-US"/>
-        </w:rPr>
-      </w:pPr>
-      <w:r>
-        <w:rPr>
-          <w:lang w:val="en-US"/>
-        </w:rPr>
-        <w:t>C = [C</w:t>
-      </w:r>
-      <w:r>
-        <w:rPr>
-          <w:vertAlign w:val="subscript"/>
-          <w:lang w:val="en-US"/>
-        </w:rPr>
-        <w:t>1</w:t>
-      </w:r>
-      <w:r>
-        <w:rPr>
-          <w:lang w:val="en-US"/>
-        </w:rPr>
-        <w:t>, C</w:t>
-      </w:r>
-      <w:r>
-        <w:rPr>
-          <w:vertAlign w:val="subscript"/>
-          <w:lang w:val="en-US"/>
-        </w:rPr>
-        <w:t>2</w:t>
-      </w:r>
-      <w:r>
-        <w:rPr>
-          <w:lang w:val="en-US"/>
-        </w:rPr>
-        <w:t>]</w:t>
-      </w:r>
-    </w:p>
-    <w:p>
-      <w:pPr>
-        <w:rPr>
-          <w:lang w:val="en-US"/>
-        </w:rPr>
-      </w:pPr>
-      <w:r>
-        <w:rPr>
-          <w:lang w:val="en-US"/>
-        </w:rPr>
-        <w:t>P = [P</w:t>
-      </w:r>
-      <w:r>
-        <w:rPr>
-          <w:vertAlign w:val="subscript"/>
-          <w:lang w:val="en-US"/>
-        </w:rPr>
-        <w:t>1</w:t>
-      </w:r>
-      <w:r>
-        <w:rPr>
-          <w:lang w:val="en-US"/>
-        </w:rPr>
-        <w:t>, P</w:t>
-      </w:r>
-      <w:r>
-        <w:rPr>
-          <w:vertAlign w:val="subscript"/>
-          <w:lang w:val="en-US"/>
-        </w:rPr>
-        <w:t>2</w:t>
-      </w:r>
-      <w:r>
-        <w:rPr>
-          <w:lang w:val="en-US"/>
-        </w:rPr>
-        <w:t>]</w:t>
-      </w:r>
-    </w:p>
-    <w:p>
-      <w:pPr>
-        <w:rPr>
-          <w:lang w:val="en-US"/>
-        </w:rPr>
-      </w:pPr>
-      <w:r>
-        <w:rPr>
-          <w:lang w:val="en-US"/>
-        </w:rPr>
-        <w:t>C</w:t>
-      </w:r>
-      <w:r>
-        <w:t xml:space="preserve"> = (</w:t>
-      </w:r>
-      <w:r>
-        <w:rPr>
-          <w:lang w:val="en-US"/>
-        </w:rPr>
-        <w:t>K</w:t>
-      </w:r>
-      <w:r>
-        <w:t>*</w:t>
-      </w:r>
-      <w:r>
-        <w:rPr>
-          <w:lang w:val="en-US"/>
-        </w:rPr>
-        <w:t>P</w:t>
-      </w:r>
-      <w:r>
-        <w:t xml:space="preserve">) </w:t>
-      </w:r>
-      <w:r>
-        <w:rPr>
-          <w:lang w:val="en-US"/>
-        </w:rPr>
-        <w:t>mod</w:t>
-      </w:r>
-      <w:r>
-        <w:t>(37)</w:t>
-      </w:r>
-      <w:r>
-        <w:t xml:space="preserve">   (1)</w:t>
-      </w:r>
-    </w:p>
-    <w:p>
-      <w:pPr>
-        <w:rPr>
-          <w:lang w:val="en-US"/>
-        </w:rPr>
-      </w:pPr>
-    </w:p>
-    <w:p>
-      <w:r>
-        <w:t xml:space="preserve">2. </w:t>
-      </w:r>
-      <w:r>
-        <w:t>Если</w:t>
-      </w:r>
-      <w:r>
-        <w:t xml:space="preserve"> </w:t>
-      </w:r>
-      <w:r>
-        <w:t>НОД(</w:t>
-      </w:r>
-      <w:r>
-        <w:rPr>
-          <w:lang w:val="en-US"/>
-        </w:rPr>
-        <w:t>det</w:t>
-      </w:r>
-      <w:r>
-        <w:t xml:space="preserve"> </w:t>
-      </w:r>
-      <w:r>
-        <w:rPr>
-          <w:lang w:val="en-US"/>
-        </w:rPr>
-        <w:t>P</w:t>
-      </w:r>
-      <w:r>
-        <w:t xml:space="preserve">, </w:t>
-      </w:r>
-      <w:r>
-        <w:rPr>
-          <w:lang w:val="en-US"/>
-        </w:rPr>
-        <w:t>n</w:t>
-      </w:r>
-      <w:r>
-        <w:t>)</w:t>
-      </w:r>
-      <w:r>
-        <w:t xml:space="preserve"> = 1, </w:t>
-      </w:r>
-      <w:r>
-        <w:t xml:space="preserve">то матрица </w:t>
-      </w:r>
-      <w:r>
-        <w:rPr>
-          <w:lang w:val="en-US"/>
-        </w:rPr>
-        <w:t>P</w:t>
-      </w:r>
-      <w:r>
-        <w:t xml:space="preserve"> </w:t>
-      </w:r>
-      <w:r>
-        <w:t xml:space="preserve">обратима </w:t>
-      </w:r>
-      <w:r>
-        <w:t xml:space="preserve">-&gt; </w:t>
-      </w:r>
-      <w:r>
-        <w:t xml:space="preserve">существует </w:t>
-      </w:r>
-      <w:r>
-        <w:rPr>
-          <w:lang w:val="en-US"/>
-        </w:rPr>
-        <w:t>P</w:t>
-      </w:r>
-      <w:r>
-        <w:rPr>
-          <w:vertAlign w:val="superscript"/>
-        </w:rPr>
-        <w:t>-1</w:t>
+        <w:t xml:space="preserve">дата обращения </w:t>
+      </w:r>
+      <w:r>
+        <w:t>20</w:t>
       </w:r>
       <w:r>
         <w:t>.</w:t>
       </w:r>
       <w:r>
-        <w:t xml:space="preserve"> </w:t>
-      </w:r>
-    </w:p>
-    <w:p>
-      <w:r>
-        <w:t>Важна также линейная независимость</w:t>
-      </w:r>
-      <w:r>
-        <w:t xml:space="preserve">, </w:t>
-      </w:r>
-      <w:r>
-        <w:t>иначе матрицу нельзя обратить</w:t>
-      </w:r>
-      <w:r>
-        <w:t>.</w:t>
-      </w:r>
-    </w:p>
-    <w:p>
-      <w:r>
-        <w:t>Иначе нужно выбрать другие блоки</w:t>
-      </w:r>
-      <w:r>
-        <w:t>.</w:t>
-      </w:r>
-    </w:p>
-    <w:p/>
-    <w:p>
-      <w:r>
-        <w:t>3</w:t>
-      </w:r>
-      <w:r>
-        <w:t xml:space="preserve">. </w:t>
-      </w:r>
-      <w:r>
-        <w:t xml:space="preserve">Преобразуем </w:t>
-      </w:r>
-      <w:r>
-        <w:t>(1)</w:t>
-      </w:r>
-    </w:p>
-    <w:p>
-      <w:r>
-        <w:rPr>
-          <w:lang w:val="en-US"/>
-        </w:rPr>
-        <w:t>C</w:t>
-      </w:r>
-      <w:r>
-        <w:t xml:space="preserve"> * </w:t>
-      </w:r>
-      <w:r>
-        <w:rPr>
-          <w:lang w:val="en-US"/>
-        </w:rPr>
-        <w:t>P</w:t>
-      </w:r>
-      <w:r>
-        <w:rPr>
-          <w:vertAlign w:val="superscript"/>
-        </w:rPr>
-        <w:t>-1</w:t>
-      </w:r>
-      <w:r>
-        <w:t xml:space="preserve"> = </w:t>
-      </w:r>
-      <w:r>
-        <w:rPr>
-          <w:lang w:val="en-US"/>
-        </w:rPr>
-        <w:t>K</w:t>
-      </w:r>
-      <w:r>
-        <w:t xml:space="preserve"> * </w:t>
-      </w:r>
-      <w:r>
-        <w:rPr>
-          <w:lang w:val="en-US"/>
-        </w:rPr>
-        <w:t>I</w:t>
-      </w:r>
-      <w:r>
-        <w:t xml:space="preserve"> = </w:t>
-      </w:r>
-      <w:r>
-        <w:rPr>
-          <w:lang w:val="en-US"/>
-        </w:rPr>
-        <w:t>K</w:t>
-      </w:r>
-    </w:p>
-    <w:p>
-      <w:pPr>
-        <w:rPr>
-          <w:lang w:val="en-US"/>
-        </w:rPr>
-      </w:pPr>
-      <w:r>
-        <w:rPr>
-          <w:lang w:val="en-US"/>
-        </w:rPr>
-        <w:t xml:space="preserve">K </w:t>
-      </w:r>
-      <w:r>
-        <w:t>найден</w:t>
-      </w:r>
-      <w:r>
-        <w:rPr>
-          <w:lang w:val="en-US"/>
-        </w:rPr>
-        <w:t>.</w:t>
-      </w:r>
-    </w:p>
-    <w:p>
-      <w:pPr>
-        <w:rPr>
-          <w:lang w:val="en-US"/>
-        </w:rPr>
-      </w:pPr>
-    </w:p>
-    <w:p>
-      <w:pPr>
-        <w:pStyle w:val="Heading3"/>
-        <w:jc w:val="center"/>
-      </w:pPr>
-      <w:r>
-        <w:t>5</w:t>
-      </w:r>
-      <w:r>
-        <w:rPr>
-          <w:lang w:val="en-US"/>
-        </w:rPr>
-        <w:t>.</w:t>
-      </w:r>
-      <w:r>
-        <w:t xml:space="preserve"> Пример</w:t>
+        <w:t>12</w:t>
+      </w:r>
+      <w:r>
+        <w:t>.2025].</w:t>
       </w:r>
     </w:p>
     <w:p/>
     <w:sectPr>
-      <w:footerReference w:type="default" r:id="rId8"/>
+      <w:footerReference w:type="default" r:id="rId9"/>
       <w:pgSz w:w="11906" w:h="16838" w:code="9"/>
       <w:pgMar w:top="1134" w:right="851" w:bottom="1134" w:left="1701" w:header="709" w:footer="709" w:gutter="0"/>
       <w:cols w:space="708"/>
@@ -3524,7 +4263,7 @@
 </file>
 
 <file path=word/endnotes.xml><?xml version="1.0" encoding="utf-8"?>
-<w:endnotes xmlns:wpc="http://schemas.microsoft.com/office/word/2010/wordprocessingCanvas" xmlns:cx="http://schemas.microsoft.com/office/drawing/2014/chartex" xmlns:cx1="http://schemas.microsoft.com/office/drawing/2015/9/8/chartex" xmlns:cx2="http://schemas.microsoft.com/office/drawing/2015/10/21/chartex" xmlns:cx3="http://schemas.microsoft.com/office/drawing/2016/5/9/chartex" xmlns:cx4="http://schemas.microsoft.com/office/drawing/2016/5/10/chartex" xmlns:cx5="http://schemas.microsoft.com/office/drawing/2016/5/11/chartex" xmlns:cx6="http://schemas.microsoft.com/office/drawing/2016/5/12/chartex" xmlns:cx7="http://schemas.microsoft.com/office/drawing/2016/5/13/chartex" xmlns:cx8="http://schemas.microsoft.com/office/drawing/2016/5/14/chartex" xmlns:mc="http://schemas.openxmlformats.org/markup-compatibility/2006" xmlns:aink="http://schemas.microsoft.com/office/drawing/2016/ink" xmlns:am3d="http://schemas.microsoft.com/office/drawing/2017/model3d" xmlns:o="urn:schemas-microsoft-com:office:office" xmlns:oel="http://schemas.microsoft.com/office/2019/extlst" xmlns:r="http://schemas.openxmlformats.org/officeDocument/2006/relationships" xmlns:m="http://schemas.openxmlformats.org/officeDocument/2006/math" xmlns:v="urn:schemas-microsoft-com:vml" xmlns:wp14="http://schemas.microsoft.com/office/word/2010/wordprocessingDrawing" xmlns:wp="http://schemas.openxmlformats.org/drawingml/2006/wordprocessingDrawing" xmlns:w10="urn:schemas-microsoft-com:office:word" xmlns:w="http://schemas.openxmlformats.org/wordprocessingml/2006/main" xmlns:w14="http://schemas.microsoft.com/office/word/2010/wordml" xmlns:w15="http://schemas.microsoft.com/office/word/2012/wordml" xmlns:w16cex="http://schemas.microsoft.com/office/word/2018/wordml/cex" xmlns:w16cid="http://schemas.microsoft.com/office/word/2016/wordml/cid" xmlns:w16="http://schemas.microsoft.com/office/word/2018/wordml" xmlns:w16du="http://schemas.microsoft.com/office/word/2023/wordml/word16du" xmlns:w16sdtdh="http://schemas.microsoft.com/office/word/2020/wordml/sdtdatahash" xmlns:w16sdtfl="http://schemas.microsoft.com/office/word/2024/wordml/sdtformatlock" xmlns:w16se="http://schemas.microsoft.com/office/word/2015/wordml/symex" xmlns:wpg="http://schemas.microsoft.com/office/word/2010/wordprocessingGroup" xmlns:wpi="http://schemas.microsoft.com/office/word/2010/wordprocessingInk" xmlns:wne="http://schemas.microsoft.com/office/word/2006/wordml" xmlns:wps="http://schemas.microsoft.com/office/word/2010/wordprocessingShape" mc:Ignorable="w14 w15 w16se w16cid w16 w16cex w16sdtdh w16sdtfl w16du wp14">
+<w:endnotes xmlns:wpc="http://schemas.microsoft.com/office/word/2010/wordprocessingCanvas" xmlns:cx="http://schemas.microsoft.com/office/drawing/2014/chartex" xmlns:cx1="http://schemas.microsoft.com/office/drawing/2015/9/8/chartex" xmlns:cx2="http://schemas.microsoft.com/office/drawing/2015/10/21/chartex" xmlns:cx3="http://schemas.microsoft.com/office/drawing/2016/5/9/chartex" xmlns:cx4="http://schemas.microsoft.com/office/drawing/2016/5/10/chartex" xmlns:cx5="http://schemas.microsoft.com/office/drawing/2016/5/11/chartex" xmlns:cx6="http://schemas.microsoft.com/office/drawing/2016/5/12/chartex" xmlns:cx7="http://schemas.microsoft.com/office/drawing/2016/5/13/chartex" xmlns:cx8="http://schemas.microsoft.com/office/drawing/2016/5/14/chartex" xmlns:mc="http://schemas.openxmlformats.org/markup-compatibility/2006" xmlns:aink="http://schemas.microsoft.com/office/drawing/2016/ink" xmlns:am3d="http://schemas.microsoft.com/office/drawing/2017/model3d" xmlns:o="urn:schemas-microsoft-com:office:office" xmlns:oel="http://schemas.microsoft.com/office/2019/extlst" xmlns:r="http://schemas.openxmlformats.org/officeDocument/2006/relationships" xmlns:m="http://schemas.openxmlformats.org/officeDocument/2006/math" xmlns:v="urn:schemas-microsoft-com:vml" xmlns:wp14="http://schemas.microsoft.com/office/word/2010/wordprocessingDrawing" xmlns:wp="http://schemas.openxmlformats.org/drawingml/2006/wordprocessingDrawing" xmlns:w10="urn:schemas-microsoft-com:office:word" xmlns:w="http://schemas.openxmlformats.org/wordprocessingml/2006/main" xmlns:w14="http://schemas.microsoft.com/office/word/2010/wordml" xmlns:w15="http://schemas.microsoft.com/office/word/2012/wordml" xmlns:w16cex="http://schemas.microsoft.com/office/word/2018/wordml/cex" xmlns:w16cid="http://schemas.microsoft.com/office/word/2016/wordml/cid" xmlns:w16="http://schemas.microsoft.com/office/word/2018/wordml" xmlns:w16sdtdh="http://schemas.microsoft.com/office/word/2020/wordml/sdtdatahash" xmlns:w16se="http://schemas.microsoft.com/office/word/2015/wordml/symex" xmlns:wpg="http://schemas.microsoft.com/office/word/2010/wordprocessingGroup" xmlns:wpi="http://schemas.microsoft.com/office/word/2010/wordprocessingInk" xmlns:wne="http://schemas.microsoft.com/office/word/2006/wordml" xmlns:wps="http://schemas.microsoft.com/office/word/2010/wordprocessingShape" mc:Ignorable="w14 w15 w16se w16cid w16 w16cex w16sdtdh wp14">
   <w:endnote w:type="separator" w:id="-1">
     <w:p>
       <w:pPr>
@@ -3549,7 +4288,7 @@
 </file>
 
 <file path=word/footer1.xml><?xml version="1.0" encoding="utf-8"?>
-<w:ftr xmlns:wpc="http://schemas.microsoft.com/office/word/2010/wordprocessingCanvas" xmlns:cx="http://schemas.microsoft.com/office/drawing/2014/chartex" xmlns:cx1="http://schemas.microsoft.com/office/drawing/2015/9/8/chartex" xmlns:cx2="http://schemas.microsoft.com/office/drawing/2015/10/21/chartex" xmlns:cx3="http://schemas.microsoft.com/office/drawing/2016/5/9/chartex" xmlns:cx4="http://schemas.microsoft.com/office/drawing/2016/5/10/chartex" xmlns:cx5="http://schemas.microsoft.com/office/drawing/2016/5/11/chartex" xmlns:cx6="http://schemas.microsoft.com/office/drawing/2016/5/12/chartex" xmlns:cx7="http://schemas.microsoft.com/office/drawing/2016/5/13/chartex" xmlns:cx8="http://schemas.microsoft.com/office/drawing/2016/5/14/chartex" xmlns:mc="http://schemas.openxmlformats.org/markup-compatibility/2006" xmlns:aink="http://schemas.microsoft.com/office/drawing/2016/ink" xmlns:am3d="http://schemas.microsoft.com/office/drawing/2017/model3d" xmlns:o="urn:schemas-microsoft-com:office:office" xmlns:oel="http://schemas.microsoft.com/office/2019/extlst" xmlns:r="http://schemas.openxmlformats.org/officeDocument/2006/relationships" xmlns:m="http://schemas.openxmlformats.org/officeDocument/2006/math" xmlns:v="urn:schemas-microsoft-com:vml" xmlns:wp14="http://schemas.microsoft.com/office/word/2010/wordprocessingDrawing" xmlns:wp="http://schemas.openxmlformats.org/drawingml/2006/wordprocessingDrawing" xmlns:w10="urn:schemas-microsoft-com:office:word" xmlns:w="http://schemas.openxmlformats.org/wordprocessingml/2006/main" xmlns:w14="http://schemas.microsoft.com/office/word/2010/wordml" xmlns:w15="http://schemas.microsoft.com/office/word/2012/wordml" xmlns:w16cex="http://schemas.microsoft.com/office/word/2018/wordml/cex" xmlns:w16cid="http://schemas.microsoft.com/office/word/2016/wordml/cid" xmlns:w16="http://schemas.microsoft.com/office/word/2018/wordml" xmlns:w16du="http://schemas.microsoft.com/office/word/2023/wordml/word16du" xmlns:w16sdtdh="http://schemas.microsoft.com/office/word/2020/wordml/sdtdatahash" xmlns:w16sdtfl="http://schemas.microsoft.com/office/word/2024/wordml/sdtformatlock" xmlns:w16se="http://schemas.microsoft.com/office/word/2015/wordml/symex" xmlns:wpg="http://schemas.microsoft.com/office/word/2010/wordprocessingGroup" xmlns:wpi="http://schemas.microsoft.com/office/word/2010/wordprocessingInk" xmlns:wne="http://schemas.microsoft.com/office/word/2006/wordml" xmlns:wps="http://schemas.microsoft.com/office/word/2010/wordprocessingShape" mc:Ignorable="w14 w15 w16se w16cid w16 w16cex w16sdtdh w16sdtfl w16du wp14">
+<w:ftr xmlns:wpc="http://schemas.microsoft.com/office/word/2010/wordprocessingCanvas" xmlns:cx="http://schemas.microsoft.com/office/drawing/2014/chartex" xmlns:cx1="http://schemas.microsoft.com/office/drawing/2015/9/8/chartex" xmlns:cx2="http://schemas.microsoft.com/office/drawing/2015/10/21/chartex" xmlns:cx3="http://schemas.microsoft.com/office/drawing/2016/5/9/chartex" xmlns:cx4="http://schemas.microsoft.com/office/drawing/2016/5/10/chartex" xmlns:cx5="http://schemas.microsoft.com/office/drawing/2016/5/11/chartex" xmlns:cx6="http://schemas.microsoft.com/office/drawing/2016/5/12/chartex" xmlns:cx7="http://schemas.microsoft.com/office/drawing/2016/5/13/chartex" xmlns:cx8="http://schemas.microsoft.com/office/drawing/2016/5/14/chartex" xmlns:mc="http://schemas.openxmlformats.org/markup-compatibility/2006" xmlns:aink="http://schemas.microsoft.com/office/drawing/2016/ink" xmlns:am3d="http://schemas.microsoft.com/office/drawing/2017/model3d" xmlns:o="urn:schemas-microsoft-com:office:office" xmlns:oel="http://schemas.microsoft.com/office/2019/extlst" xmlns:r="http://schemas.openxmlformats.org/officeDocument/2006/relationships" xmlns:m="http://schemas.openxmlformats.org/officeDocument/2006/math" xmlns:v="urn:schemas-microsoft-com:vml" xmlns:wp14="http://schemas.microsoft.com/office/word/2010/wordprocessingDrawing" xmlns:wp="http://schemas.openxmlformats.org/drawingml/2006/wordprocessingDrawing" xmlns:w10="urn:schemas-microsoft-com:office:word" xmlns:w="http://schemas.openxmlformats.org/wordprocessingml/2006/main" xmlns:w14="http://schemas.microsoft.com/office/word/2010/wordml" xmlns:w15="http://schemas.microsoft.com/office/word/2012/wordml" xmlns:w16cex="http://schemas.microsoft.com/office/word/2018/wordml/cex" xmlns:w16cid="http://schemas.microsoft.com/office/word/2016/wordml/cid" xmlns:w16="http://schemas.microsoft.com/office/word/2018/wordml" xmlns:w16sdtdh="http://schemas.microsoft.com/office/word/2020/wordml/sdtdatahash" xmlns:w16se="http://schemas.microsoft.com/office/word/2015/wordml/symex" xmlns:wpg="http://schemas.microsoft.com/office/word/2010/wordprocessingGroup" xmlns:wpi="http://schemas.microsoft.com/office/word/2010/wordprocessingInk" xmlns:wne="http://schemas.microsoft.com/office/word/2006/wordml" xmlns:wps="http://schemas.microsoft.com/office/word/2010/wordprocessingShape" mc:Ignorable="w14 w15 w16se w16cid w16 w16cex w16sdtdh wp14">
   <w:sdt>
     <w:sdtPr>
       <w:id w:val="788556981"/>
@@ -3561,7 +4300,7 @@
     <w:sdtContent>
       <w:p>
         <w:pPr>
-          <w:pStyle w:val="Footer"/>
+          <w:pStyle w:val="ae"/>
           <w:jc w:val="center"/>
         </w:pPr>
         <w:r>
@@ -3586,7 +4325,7 @@
 </file>
 
 <file path=word/footnotes.xml><?xml version="1.0" encoding="utf-8"?>
-<w:footnotes xmlns:wpc="http://schemas.microsoft.com/office/word/2010/wordprocessingCanvas" xmlns:cx="http://schemas.microsoft.com/office/drawing/2014/chartex" xmlns:cx1="http://schemas.microsoft.com/office/drawing/2015/9/8/chartex" xmlns:cx2="http://schemas.microsoft.com/office/drawing/2015/10/21/chartex" xmlns:cx3="http://schemas.microsoft.com/office/drawing/2016/5/9/chartex" xmlns:cx4="http://schemas.microsoft.com/office/drawing/2016/5/10/chartex" xmlns:cx5="http://schemas.microsoft.com/office/drawing/2016/5/11/chartex" xmlns:cx6="http://schemas.microsoft.com/office/drawing/2016/5/12/chartex" xmlns:cx7="http://schemas.microsoft.com/office/drawing/2016/5/13/chartex" xmlns:cx8="http://schemas.microsoft.com/office/drawing/2016/5/14/chartex" xmlns:mc="http://schemas.openxmlformats.org/markup-compatibility/2006" xmlns:aink="http://schemas.microsoft.com/office/drawing/2016/ink" xmlns:am3d="http://schemas.microsoft.com/office/drawing/2017/model3d" xmlns:o="urn:schemas-microsoft-com:office:office" xmlns:oel="http://schemas.microsoft.com/office/2019/extlst" xmlns:r="http://schemas.openxmlformats.org/officeDocument/2006/relationships" xmlns:m="http://schemas.openxmlformats.org/officeDocument/2006/math" xmlns:v="urn:schemas-microsoft-com:vml" xmlns:wp14="http://schemas.microsoft.com/office/word/2010/wordprocessingDrawing" xmlns:wp="http://schemas.openxmlformats.org/drawingml/2006/wordprocessingDrawing" xmlns:w10="urn:schemas-microsoft-com:office:word" xmlns:w="http://schemas.openxmlformats.org/wordprocessingml/2006/main" xmlns:w14="http://schemas.microsoft.com/office/word/2010/wordml" xmlns:w15="http://schemas.microsoft.com/office/word/2012/wordml" xmlns:w16cex="http://schemas.microsoft.com/office/word/2018/wordml/cex" xmlns:w16cid="http://schemas.microsoft.com/office/word/2016/wordml/cid" xmlns:w16="http://schemas.microsoft.com/office/word/2018/wordml" xmlns:w16du="http://schemas.microsoft.com/office/word/2023/wordml/word16du" xmlns:w16sdtdh="http://schemas.microsoft.com/office/word/2020/wordml/sdtdatahash" xmlns:w16sdtfl="http://schemas.microsoft.com/office/word/2024/wordml/sdtformatlock" xmlns:w16se="http://schemas.microsoft.com/office/word/2015/wordml/symex" xmlns:wpg="http://schemas.microsoft.com/office/word/2010/wordprocessingGroup" xmlns:wpi="http://schemas.microsoft.com/office/word/2010/wordprocessingInk" xmlns:wne="http://schemas.microsoft.com/office/word/2006/wordml" xmlns:wps="http://schemas.microsoft.com/office/word/2010/wordprocessingShape" mc:Ignorable="w14 w15 w16se w16cid w16 w16cex w16sdtdh w16sdtfl w16du wp14">
+<w:footnotes xmlns:wpc="http://schemas.microsoft.com/office/word/2010/wordprocessingCanvas" xmlns:cx="http://schemas.microsoft.com/office/drawing/2014/chartex" xmlns:cx1="http://schemas.microsoft.com/office/drawing/2015/9/8/chartex" xmlns:cx2="http://schemas.microsoft.com/office/drawing/2015/10/21/chartex" xmlns:cx3="http://schemas.microsoft.com/office/drawing/2016/5/9/chartex" xmlns:cx4="http://schemas.microsoft.com/office/drawing/2016/5/10/chartex" xmlns:cx5="http://schemas.microsoft.com/office/drawing/2016/5/11/chartex" xmlns:cx6="http://schemas.microsoft.com/office/drawing/2016/5/12/chartex" xmlns:cx7="http://schemas.microsoft.com/office/drawing/2016/5/13/chartex" xmlns:cx8="http://schemas.microsoft.com/office/drawing/2016/5/14/chartex" xmlns:mc="http://schemas.openxmlformats.org/markup-compatibility/2006" xmlns:aink="http://schemas.microsoft.com/office/drawing/2016/ink" xmlns:am3d="http://schemas.microsoft.com/office/drawing/2017/model3d" xmlns:o="urn:schemas-microsoft-com:office:office" xmlns:oel="http://schemas.microsoft.com/office/2019/extlst" xmlns:r="http://schemas.openxmlformats.org/officeDocument/2006/relationships" xmlns:m="http://schemas.openxmlformats.org/officeDocument/2006/math" xmlns:v="urn:schemas-microsoft-com:vml" xmlns:wp14="http://schemas.microsoft.com/office/word/2010/wordprocessingDrawing" xmlns:wp="http://schemas.openxmlformats.org/drawingml/2006/wordprocessingDrawing" xmlns:w10="urn:schemas-microsoft-com:office:word" xmlns:w="http://schemas.openxmlformats.org/wordprocessingml/2006/main" xmlns:w14="http://schemas.microsoft.com/office/word/2010/wordml" xmlns:w15="http://schemas.microsoft.com/office/word/2012/wordml" xmlns:w16cex="http://schemas.microsoft.com/office/word/2018/wordml/cex" xmlns:w16cid="http://schemas.microsoft.com/office/word/2016/wordml/cid" xmlns:w16="http://schemas.microsoft.com/office/word/2018/wordml" xmlns:w16sdtdh="http://schemas.microsoft.com/office/word/2020/wordml/sdtdatahash" xmlns:w16se="http://schemas.microsoft.com/office/word/2015/wordml/symex" xmlns:wpg="http://schemas.microsoft.com/office/word/2010/wordprocessingGroup" xmlns:wpi="http://schemas.microsoft.com/office/word/2010/wordprocessingInk" xmlns:wne="http://schemas.microsoft.com/office/word/2006/wordml" xmlns:wps="http://schemas.microsoft.com/office/word/2010/wordprocessingShape" mc:Ignorable="w14 w15 w16se w16cid w16 w16cex w16sdtdh wp14">
   <w:footnote w:type="separator" w:id="-1">
     <w:p>
       <w:pPr>
@@ -3611,7 +4350,7 @@
 </file>
 
 <file path=word/numbering.xml><?xml version="1.0" encoding="utf-8"?>
-<w:numbering xmlns:wpc="http://schemas.microsoft.com/office/word/2010/wordprocessingCanvas" xmlns:cx="http://schemas.microsoft.com/office/drawing/2014/chartex" xmlns:cx1="http://schemas.microsoft.com/office/drawing/2015/9/8/chartex" xmlns:cx2="http://schemas.microsoft.com/office/drawing/2015/10/21/chartex" xmlns:cx3="http://schemas.microsoft.com/office/drawing/2016/5/9/chartex" xmlns:cx4="http://schemas.microsoft.com/office/drawing/2016/5/10/chartex" xmlns:cx5="http://schemas.microsoft.com/office/drawing/2016/5/11/chartex" xmlns:cx6="http://schemas.microsoft.com/office/drawing/2016/5/12/chartex" xmlns:cx7="http://schemas.microsoft.com/office/drawing/2016/5/13/chartex" xmlns:cx8="http://schemas.microsoft.com/office/drawing/2016/5/14/chartex" xmlns:mc="http://schemas.openxmlformats.org/markup-compatibility/2006" xmlns:aink="http://schemas.microsoft.com/office/drawing/2016/ink" xmlns:am3d="http://schemas.microsoft.com/office/drawing/2017/model3d" xmlns:o="urn:schemas-microsoft-com:office:office" xmlns:oel="http://schemas.microsoft.com/office/2019/extlst" xmlns:r="http://schemas.openxmlformats.org/officeDocument/2006/relationships" xmlns:m="http://schemas.openxmlformats.org/officeDocument/2006/math" xmlns:v="urn:schemas-microsoft-com:vml" xmlns:wp14="http://schemas.microsoft.com/office/word/2010/wordprocessingDrawing" xmlns:wp="http://schemas.openxmlformats.org/drawingml/2006/wordprocessingDrawing" xmlns:w10="urn:schemas-microsoft-com:office:word" xmlns:w="http://schemas.openxmlformats.org/wordprocessingml/2006/main" xmlns:w14="http://schemas.microsoft.com/office/word/2010/wordml" xmlns:w15="http://schemas.microsoft.com/office/word/2012/wordml" xmlns:w16cex="http://schemas.microsoft.com/office/word/2018/wordml/cex" xmlns:w16cid="http://schemas.microsoft.com/office/word/2016/wordml/cid" xmlns:w16="http://schemas.microsoft.com/office/word/2018/wordml" xmlns:w16du="http://schemas.microsoft.com/office/word/2023/wordml/word16du" xmlns:w16sdtdh="http://schemas.microsoft.com/office/word/2020/wordml/sdtdatahash" xmlns:w16sdtfl="http://schemas.microsoft.com/office/word/2024/wordml/sdtformatlock" xmlns:w16se="http://schemas.microsoft.com/office/word/2015/wordml/symex" xmlns:wpg="http://schemas.microsoft.com/office/word/2010/wordprocessingGroup" xmlns:wpi="http://schemas.microsoft.com/office/word/2010/wordprocessingInk" xmlns:wne="http://schemas.microsoft.com/office/word/2006/wordml" xmlns:wps="http://schemas.microsoft.com/office/word/2010/wordprocessingShape" mc:Ignorable="w14 w15 w16se w16cid w16 w16cex w16sdtdh w16sdtfl w16du wp14">
+<w:numbering xmlns:wpc="http://schemas.microsoft.com/office/word/2010/wordprocessingCanvas" xmlns:cx="http://schemas.microsoft.com/office/drawing/2014/chartex" xmlns:cx1="http://schemas.microsoft.com/office/drawing/2015/9/8/chartex" xmlns:cx2="http://schemas.microsoft.com/office/drawing/2015/10/21/chartex" xmlns:cx3="http://schemas.microsoft.com/office/drawing/2016/5/9/chartex" xmlns:cx4="http://schemas.microsoft.com/office/drawing/2016/5/10/chartex" xmlns:cx5="http://schemas.microsoft.com/office/drawing/2016/5/11/chartex" xmlns:cx6="http://schemas.microsoft.com/office/drawing/2016/5/12/chartex" xmlns:cx7="http://schemas.microsoft.com/office/drawing/2016/5/13/chartex" xmlns:cx8="http://schemas.microsoft.com/office/drawing/2016/5/14/chartex" xmlns:mc="http://schemas.openxmlformats.org/markup-compatibility/2006" xmlns:aink="http://schemas.microsoft.com/office/drawing/2016/ink" xmlns:am3d="http://schemas.microsoft.com/office/drawing/2017/model3d" xmlns:o="urn:schemas-microsoft-com:office:office" xmlns:oel="http://schemas.microsoft.com/office/2019/extlst" xmlns:r="http://schemas.openxmlformats.org/officeDocument/2006/relationships" xmlns:m="http://schemas.openxmlformats.org/officeDocument/2006/math" xmlns:v="urn:schemas-microsoft-com:vml" xmlns:wp14="http://schemas.microsoft.com/office/word/2010/wordprocessingDrawing" xmlns:wp="http://schemas.openxmlformats.org/drawingml/2006/wordprocessingDrawing" xmlns:w10="urn:schemas-microsoft-com:office:word" xmlns:w="http://schemas.openxmlformats.org/wordprocessingml/2006/main" xmlns:w14="http://schemas.microsoft.com/office/word/2010/wordml" xmlns:w15="http://schemas.microsoft.com/office/word/2012/wordml" xmlns:w16cex="http://schemas.microsoft.com/office/word/2018/wordml/cex" xmlns:w16cid="http://schemas.microsoft.com/office/word/2016/wordml/cid" xmlns:w16="http://schemas.microsoft.com/office/word/2018/wordml" xmlns:w16sdtdh="http://schemas.microsoft.com/office/word/2020/wordml/sdtdatahash" xmlns:w16se="http://schemas.microsoft.com/office/word/2015/wordml/symex" xmlns:wpg="http://schemas.microsoft.com/office/word/2010/wordprocessingGroup" xmlns:wpi="http://schemas.microsoft.com/office/word/2010/wordprocessingInk" xmlns:wne="http://schemas.microsoft.com/office/word/2006/wordml" xmlns:wps="http://schemas.microsoft.com/office/word/2010/wordprocessingShape" mc:Ignorable="w14 w15 w16se w16cid w16 w16cex w16sdtdh wp14">
   <w:abstractNum w:abstractNumId="0" w15:restartNumberingAfterBreak="0">
     <w:nsid w:val="0A0D3BE5"/>
     <w:multiLevelType w:val="multilevel"/>
@@ -5091,7 +5830,7 @@
 </file>
 
 <file path=word/styles.xml><?xml version="1.0" encoding="utf-8"?>
-<w:styles xmlns:mc="http://schemas.openxmlformats.org/markup-compatibility/2006" xmlns:r="http://schemas.openxmlformats.org/officeDocument/2006/relationships" xmlns:w="http://schemas.openxmlformats.org/wordprocessingml/2006/main" xmlns:w14="http://schemas.microsoft.com/office/word/2010/wordml" xmlns:w15="http://schemas.microsoft.com/office/word/2012/wordml" xmlns:w16cex="http://schemas.microsoft.com/office/word/2018/wordml/cex" xmlns:w16cid="http://schemas.microsoft.com/office/word/2016/wordml/cid" xmlns:w16="http://schemas.microsoft.com/office/word/2018/wordml" xmlns:w16du="http://schemas.microsoft.com/office/word/2023/wordml/word16du" xmlns:w16sdtdh="http://schemas.microsoft.com/office/word/2020/wordml/sdtdatahash" xmlns:w16sdtfl="http://schemas.microsoft.com/office/word/2024/wordml/sdtformatlock" xmlns:w16se="http://schemas.microsoft.com/office/word/2015/wordml/symex" mc:Ignorable="w14 w15 w16se w16cid w16 w16cex w16sdtdh w16sdtfl w16du">
+<w:styles xmlns:mc="http://schemas.openxmlformats.org/markup-compatibility/2006" xmlns:r="http://schemas.openxmlformats.org/officeDocument/2006/relationships" xmlns:w="http://schemas.openxmlformats.org/wordprocessingml/2006/main" xmlns:w14="http://schemas.microsoft.com/office/word/2010/wordml" xmlns:w15="http://schemas.microsoft.com/office/word/2012/wordml" xmlns:w16cex="http://schemas.microsoft.com/office/word/2018/wordml/cex" xmlns:w16cid="http://schemas.microsoft.com/office/word/2016/wordml/cid" xmlns:w16="http://schemas.microsoft.com/office/word/2018/wordml" xmlns:w16sdtdh="http://schemas.microsoft.com/office/word/2020/wordml/sdtdatahash" xmlns:w16se="http://schemas.microsoft.com/office/word/2015/wordml/symex" mc:Ignorable="w14 w15 w16se w16cid w16 w16cex w16sdtdh">
   <w:docDefaults>
     <w:rPrDefault>
       <w:rPr>
@@ -5487,7 +6226,7 @@
     <w:lsdException w:name="Unresolved Mention" w:semiHidden="1" w:unhideWhenUsed="1"/>
     <w:lsdException w:name="Smart Link" w:semiHidden="1" w:unhideWhenUsed="1"/>
   </w:latentStyles>
-  <w:style w:type="paragraph" w:default="1" w:styleId="Normal">
+  <w:style w:type="paragraph" w:default="1" w:styleId="a">
     <w:name w:val="Normal"/>
     <w:qFormat/>
     <w:rsid w:val="00A51775"/>
@@ -5496,11 +6235,11 @@
       <w:sz w:val="28"/>
     </w:rPr>
   </w:style>
-  <w:style w:type="paragraph" w:styleId="Heading1">
+  <w:style w:type="paragraph" w:styleId="1">
     <w:name w:val="heading 1"/>
-    <w:basedOn w:val="Normal"/>
-    <w:next w:val="Normal"/>
-    <w:link w:val="Heading1Char"/>
+    <w:basedOn w:val="a"/>
+    <w:next w:val="a"/>
+    <w:link w:val="10"/>
     <w:uiPriority w:val="9"/>
     <w:qFormat/>
     <w:rsid w:val="00D63F26"/>
@@ -5516,11 +6255,11 @@
       <w:szCs w:val="40"/>
     </w:rPr>
   </w:style>
-  <w:style w:type="paragraph" w:styleId="Heading2">
+  <w:style w:type="paragraph" w:styleId="2">
     <w:name w:val="heading 2"/>
-    <w:basedOn w:val="Normal"/>
-    <w:next w:val="Normal"/>
-    <w:link w:val="Heading2Char"/>
+    <w:basedOn w:val="a"/>
+    <w:next w:val="a"/>
+    <w:link w:val="20"/>
     <w:uiPriority w:val="9"/>
     <w:unhideWhenUsed/>
     <w:qFormat/>
@@ -5537,11 +6276,11 @@
       <w:szCs w:val="32"/>
     </w:rPr>
   </w:style>
-  <w:style w:type="paragraph" w:styleId="Heading3">
+  <w:style w:type="paragraph" w:styleId="3">
     <w:name w:val="heading 3"/>
-    <w:basedOn w:val="Normal"/>
-    <w:next w:val="Normal"/>
-    <w:link w:val="Heading3Char"/>
+    <w:basedOn w:val="a"/>
+    <w:next w:val="a"/>
+    <w:link w:val="30"/>
     <w:uiPriority w:val="9"/>
     <w:unhideWhenUsed/>
     <w:qFormat/>
@@ -5558,11 +6297,11 @@
       <w:szCs w:val="28"/>
     </w:rPr>
   </w:style>
-  <w:style w:type="paragraph" w:styleId="Heading4">
+  <w:style w:type="paragraph" w:styleId="4">
     <w:name w:val="heading 4"/>
-    <w:basedOn w:val="Normal"/>
-    <w:next w:val="Normal"/>
-    <w:link w:val="Heading4Char"/>
+    <w:basedOn w:val="a"/>
+    <w:next w:val="a"/>
+    <w:link w:val="40"/>
     <w:uiPriority w:val="9"/>
     <w:unhideWhenUsed/>
     <w:qFormat/>
@@ -5580,11 +6319,11 @@
       <w:color w:val="0F4761" w:themeColor="accent1" w:themeShade="BF"/>
     </w:rPr>
   </w:style>
-  <w:style w:type="paragraph" w:styleId="Heading5">
+  <w:style w:type="paragraph" w:styleId="5">
     <w:name w:val="heading 5"/>
-    <w:basedOn w:val="Normal"/>
-    <w:next w:val="Normal"/>
-    <w:link w:val="Heading5Char"/>
+    <w:basedOn w:val="a"/>
+    <w:next w:val="a"/>
+    <w:link w:val="50"/>
     <w:uiPriority w:val="9"/>
     <w:semiHidden/>
     <w:unhideWhenUsed/>
@@ -5601,11 +6340,11 @@
       <w:color w:val="0F4761" w:themeColor="accent1" w:themeShade="BF"/>
     </w:rPr>
   </w:style>
-  <w:style w:type="paragraph" w:styleId="Heading6">
+  <w:style w:type="paragraph" w:styleId="6">
     <w:name w:val="heading 6"/>
-    <w:basedOn w:val="Normal"/>
-    <w:next w:val="Normal"/>
-    <w:link w:val="Heading6Char"/>
+    <w:basedOn w:val="a"/>
+    <w:next w:val="a"/>
+    <w:link w:val="60"/>
     <w:uiPriority w:val="9"/>
     <w:semiHidden/>
     <w:unhideWhenUsed/>
@@ -5624,11 +6363,11 @@
       <w:color w:val="595959" w:themeColor="text1" w:themeTint="A6"/>
     </w:rPr>
   </w:style>
-  <w:style w:type="paragraph" w:styleId="Heading7">
+  <w:style w:type="paragraph" w:styleId="7">
     <w:name w:val="heading 7"/>
-    <w:basedOn w:val="Normal"/>
-    <w:next w:val="Normal"/>
-    <w:link w:val="Heading7Char"/>
+    <w:basedOn w:val="a"/>
+    <w:next w:val="a"/>
+    <w:link w:val="70"/>
     <w:uiPriority w:val="9"/>
     <w:semiHidden/>
     <w:unhideWhenUsed/>
@@ -5645,11 +6384,11 @@
       <w:color w:val="595959" w:themeColor="text1" w:themeTint="A6"/>
     </w:rPr>
   </w:style>
-  <w:style w:type="paragraph" w:styleId="Heading8">
+  <w:style w:type="paragraph" w:styleId="8">
     <w:name w:val="heading 8"/>
-    <w:basedOn w:val="Normal"/>
-    <w:next w:val="Normal"/>
-    <w:link w:val="Heading8Char"/>
+    <w:basedOn w:val="a"/>
+    <w:next w:val="a"/>
+    <w:link w:val="80"/>
     <w:uiPriority w:val="9"/>
     <w:semiHidden/>
     <w:unhideWhenUsed/>
@@ -5668,11 +6407,11 @@
       <w:color w:val="272727" w:themeColor="text1" w:themeTint="D8"/>
     </w:rPr>
   </w:style>
-  <w:style w:type="paragraph" w:styleId="Heading9">
+  <w:style w:type="paragraph" w:styleId="9">
     <w:name w:val="heading 9"/>
-    <w:basedOn w:val="Normal"/>
-    <w:next w:val="Normal"/>
-    <w:link w:val="Heading9Char"/>
+    <w:basedOn w:val="a"/>
+    <w:next w:val="a"/>
+    <w:link w:val="90"/>
     <w:uiPriority w:val="9"/>
     <w:semiHidden/>
     <w:unhideWhenUsed/>
@@ -5689,12 +6428,12 @@
       <w:color w:val="272727" w:themeColor="text1" w:themeTint="D8"/>
     </w:rPr>
   </w:style>
-  <w:style w:type="character" w:default="1" w:styleId="DefaultParagraphFont">
+  <w:style w:type="character" w:default="1" w:styleId="a0">
     <w:name w:val="Default Paragraph Font"/>
     <w:uiPriority w:val="1"/>
     <w:unhideWhenUsed/>
   </w:style>
-  <w:style w:type="table" w:default="1" w:styleId="TableNormal">
+  <w:style w:type="table" w:default="1" w:styleId="a1">
     <w:name w:val="Normal Table"/>
     <w:uiPriority w:val="99"/>
     <w:semiHidden/>
@@ -5709,16 +6448,16 @@
       </w:tblCellMar>
     </w:tblPr>
   </w:style>
-  <w:style w:type="numbering" w:default="1" w:styleId="NoList">
+  <w:style w:type="numbering" w:default="1" w:styleId="a2">
     <w:name w:val="No List"/>
     <w:uiPriority w:val="99"/>
     <w:semiHidden/>
     <w:unhideWhenUsed/>
   </w:style>
-  <w:style w:type="character" w:customStyle="1" w:styleId="Heading1Char">
-    <w:name w:val="Heading 1 Char"/>
-    <w:basedOn w:val="DefaultParagraphFont"/>
-    <w:link w:val="Heading1"/>
+  <w:style w:type="character" w:customStyle="1" w:styleId="10">
+    <w:name w:val="Заголовок 1 Знак"/>
+    <w:basedOn w:val="a0"/>
+    <w:link w:val="1"/>
     <w:uiPriority w:val="9"/>
     <w:rsid w:val="00D63F26"/>
     <w:rPr>
@@ -5727,10 +6466,10 @@
       <w:szCs w:val="40"/>
     </w:rPr>
   </w:style>
-  <w:style w:type="character" w:customStyle="1" w:styleId="Heading2Char">
-    <w:name w:val="Heading 2 Char"/>
-    <w:basedOn w:val="DefaultParagraphFont"/>
-    <w:link w:val="Heading2"/>
+  <w:style w:type="character" w:customStyle="1" w:styleId="20">
+    <w:name w:val="Заголовок 2 Знак"/>
+    <w:basedOn w:val="a0"/>
+    <w:link w:val="2"/>
     <w:uiPriority w:val="9"/>
     <w:rsid w:val="007F479D"/>
     <w:rPr>
@@ -5739,10 +6478,10 @@
       <w:szCs w:val="32"/>
     </w:rPr>
   </w:style>
-  <w:style w:type="character" w:customStyle="1" w:styleId="Heading3Char">
-    <w:name w:val="Heading 3 Char"/>
-    <w:basedOn w:val="DefaultParagraphFont"/>
-    <w:link w:val="Heading3"/>
+  <w:style w:type="character" w:customStyle="1" w:styleId="30">
+    <w:name w:val="Заголовок 3 Знак"/>
+    <w:basedOn w:val="a0"/>
+    <w:link w:val="3"/>
     <w:uiPriority w:val="9"/>
     <w:rsid w:val="00584A9D"/>
     <w:rPr>
@@ -5752,10 +6491,10 @@
       <w:szCs w:val="28"/>
     </w:rPr>
   </w:style>
-  <w:style w:type="character" w:customStyle="1" w:styleId="Heading4Char">
-    <w:name w:val="Heading 4 Char"/>
-    <w:basedOn w:val="DefaultParagraphFont"/>
-    <w:link w:val="Heading4"/>
+  <w:style w:type="character" w:customStyle="1" w:styleId="40">
+    <w:name w:val="Заголовок 4 Знак"/>
+    <w:basedOn w:val="a0"/>
+    <w:link w:val="4"/>
     <w:uiPriority w:val="9"/>
     <w:rsid w:val="0048629A"/>
     <w:rPr>
@@ -5765,10 +6504,10 @@
       <w:color w:val="0F4761" w:themeColor="accent1" w:themeShade="BF"/>
     </w:rPr>
   </w:style>
-  <w:style w:type="character" w:customStyle="1" w:styleId="Heading5Char">
-    <w:name w:val="Heading 5 Char"/>
-    <w:basedOn w:val="DefaultParagraphFont"/>
-    <w:link w:val="Heading5"/>
+  <w:style w:type="character" w:customStyle="1" w:styleId="50">
+    <w:name w:val="Заголовок 5 Знак"/>
+    <w:basedOn w:val="a0"/>
+    <w:link w:val="5"/>
     <w:uiPriority w:val="9"/>
     <w:semiHidden/>
     <w:rsid w:val="0048629A"/>
@@ -5777,10 +6516,10 @@
       <w:color w:val="0F4761" w:themeColor="accent1" w:themeShade="BF"/>
     </w:rPr>
   </w:style>
-  <w:style w:type="character" w:customStyle="1" w:styleId="Heading6Char">
-    <w:name w:val="Heading 6 Char"/>
-    <w:basedOn w:val="DefaultParagraphFont"/>
-    <w:link w:val="Heading6"/>
+  <w:style w:type="character" w:customStyle="1" w:styleId="60">
+    <w:name w:val="Заголовок 6 Знак"/>
+    <w:basedOn w:val="a0"/>
+    <w:link w:val="6"/>
     <w:uiPriority w:val="9"/>
     <w:semiHidden/>
     <w:rsid w:val="0048629A"/>
@@ -5791,10 +6530,10 @@
       <w:color w:val="595959" w:themeColor="text1" w:themeTint="A6"/>
     </w:rPr>
   </w:style>
-  <w:style w:type="character" w:customStyle="1" w:styleId="Heading7Char">
-    <w:name w:val="Heading 7 Char"/>
-    <w:basedOn w:val="DefaultParagraphFont"/>
-    <w:link w:val="Heading7"/>
+  <w:style w:type="character" w:customStyle="1" w:styleId="70">
+    <w:name w:val="Заголовок 7 Знак"/>
+    <w:basedOn w:val="a0"/>
+    <w:link w:val="7"/>
     <w:uiPriority w:val="9"/>
     <w:semiHidden/>
     <w:rsid w:val="0048629A"/>
@@ -5803,10 +6542,10 @@
       <w:color w:val="595959" w:themeColor="text1" w:themeTint="A6"/>
     </w:rPr>
   </w:style>
-  <w:style w:type="character" w:customStyle="1" w:styleId="Heading8Char">
-    <w:name w:val="Heading 8 Char"/>
-    <w:basedOn w:val="DefaultParagraphFont"/>
-    <w:link w:val="Heading8"/>
+  <w:style w:type="character" w:customStyle="1" w:styleId="80">
+    <w:name w:val="Заголовок 8 Знак"/>
+    <w:basedOn w:val="a0"/>
+    <w:link w:val="8"/>
     <w:uiPriority w:val="9"/>
     <w:semiHidden/>
     <w:rsid w:val="0048629A"/>
@@ -5817,10 +6556,10 @@
       <w:color w:val="272727" w:themeColor="text1" w:themeTint="D8"/>
     </w:rPr>
   </w:style>
-  <w:style w:type="character" w:customStyle="1" w:styleId="Heading9Char">
-    <w:name w:val="Heading 9 Char"/>
-    <w:basedOn w:val="DefaultParagraphFont"/>
-    <w:link w:val="Heading9"/>
+  <w:style w:type="character" w:customStyle="1" w:styleId="90">
+    <w:name w:val="Заголовок 9 Знак"/>
+    <w:basedOn w:val="a0"/>
+    <w:link w:val="9"/>
     <w:uiPriority w:val="9"/>
     <w:semiHidden/>
     <w:rsid w:val="0048629A"/>
@@ -5829,11 +6568,11 @@
       <w:color w:val="272727" w:themeColor="text1" w:themeTint="D8"/>
     </w:rPr>
   </w:style>
-  <w:style w:type="paragraph" w:styleId="Title">
+  <w:style w:type="paragraph" w:styleId="a3">
     <w:name w:val="Title"/>
-    <w:basedOn w:val="Normal"/>
-    <w:next w:val="Normal"/>
-    <w:link w:val="TitleChar"/>
+    <w:basedOn w:val="a"/>
+    <w:next w:val="a"/>
+    <w:link w:val="a4"/>
     <w:uiPriority w:val="10"/>
     <w:qFormat/>
     <w:rsid w:val="007F479D"/>
@@ -5849,10 +6588,10 @@
       <w:szCs w:val="56"/>
     </w:rPr>
   </w:style>
-  <w:style w:type="character" w:customStyle="1" w:styleId="TitleChar">
-    <w:name w:val="Title Char"/>
-    <w:basedOn w:val="DefaultParagraphFont"/>
-    <w:link w:val="Title"/>
+  <w:style w:type="character" w:customStyle="1" w:styleId="a4">
+    <w:name w:val="Заголовок Знак"/>
+    <w:basedOn w:val="a0"/>
+    <w:link w:val="a3"/>
     <w:uiPriority w:val="10"/>
     <w:rsid w:val="007F479D"/>
     <w:rPr>
@@ -5863,11 +6602,11 @@
       <w:szCs w:val="56"/>
     </w:rPr>
   </w:style>
-  <w:style w:type="paragraph" w:styleId="Subtitle">
+  <w:style w:type="paragraph" w:styleId="a5">
     <w:name w:val="Subtitle"/>
-    <w:basedOn w:val="Normal"/>
-    <w:next w:val="Normal"/>
-    <w:link w:val="SubtitleChar"/>
+    <w:basedOn w:val="a"/>
+    <w:next w:val="a"/>
+    <w:link w:val="a6"/>
     <w:uiPriority w:val="11"/>
     <w:qFormat/>
     <w:rsid w:val="0048629A"/>
@@ -5883,10 +6622,10 @@
       <w:szCs w:val="28"/>
     </w:rPr>
   </w:style>
-  <w:style w:type="character" w:customStyle="1" w:styleId="SubtitleChar">
-    <w:name w:val="Subtitle Char"/>
-    <w:basedOn w:val="DefaultParagraphFont"/>
-    <w:link w:val="Subtitle"/>
+  <w:style w:type="character" w:customStyle="1" w:styleId="a6">
+    <w:name w:val="Подзаголовок Знак"/>
+    <w:basedOn w:val="a0"/>
+    <w:link w:val="a5"/>
     <w:uiPriority w:val="11"/>
     <w:rsid w:val="0048629A"/>
     <w:rPr>
@@ -5897,11 +6636,11 @@
       <w:szCs w:val="28"/>
     </w:rPr>
   </w:style>
-  <w:style w:type="paragraph" w:styleId="Quote">
+  <w:style w:type="paragraph" w:styleId="21">
     <w:name w:val="Quote"/>
-    <w:basedOn w:val="Normal"/>
-    <w:next w:val="Normal"/>
-    <w:link w:val="QuoteChar"/>
+    <w:basedOn w:val="a"/>
+    <w:next w:val="a"/>
+    <w:link w:val="22"/>
     <w:uiPriority w:val="29"/>
     <w:qFormat/>
     <w:rsid w:val="0048629A"/>
@@ -5915,10 +6654,10 @@
       <w:color w:val="404040" w:themeColor="text1" w:themeTint="BF"/>
     </w:rPr>
   </w:style>
-  <w:style w:type="character" w:customStyle="1" w:styleId="QuoteChar">
-    <w:name w:val="Quote Char"/>
-    <w:basedOn w:val="DefaultParagraphFont"/>
-    <w:link w:val="Quote"/>
+  <w:style w:type="character" w:customStyle="1" w:styleId="22">
+    <w:name w:val="Цитата 2 Знак"/>
+    <w:basedOn w:val="a0"/>
+    <w:link w:val="21"/>
     <w:uiPriority w:val="29"/>
     <w:rsid w:val="0048629A"/>
     <w:rPr>
@@ -5927,9 +6666,9 @@
       <w:color w:val="404040" w:themeColor="text1" w:themeTint="BF"/>
     </w:rPr>
   </w:style>
-  <w:style w:type="paragraph" w:styleId="ListParagraph">
+  <w:style w:type="paragraph" w:styleId="a7">
     <w:name w:val="List Paragraph"/>
-    <w:basedOn w:val="Normal"/>
+    <w:basedOn w:val="a"/>
     <w:uiPriority w:val="34"/>
     <w:qFormat/>
     <w:rsid w:val="0048629A"/>
@@ -5938,9 +6677,9 @@
       <w:contextualSpacing/>
     </w:pPr>
   </w:style>
-  <w:style w:type="character" w:styleId="IntenseEmphasis">
+  <w:style w:type="character" w:styleId="a8">
     <w:name w:val="Intense Emphasis"/>
-    <w:basedOn w:val="DefaultParagraphFont"/>
+    <w:basedOn w:val="a0"/>
     <w:uiPriority w:val="21"/>
     <w:qFormat/>
     <w:rsid w:val="0048629A"/>
@@ -5950,11 +6689,11 @@
       <w:color w:val="0F4761" w:themeColor="accent1" w:themeShade="BF"/>
     </w:rPr>
   </w:style>
-  <w:style w:type="paragraph" w:styleId="IntenseQuote">
+  <w:style w:type="paragraph" w:styleId="a9">
     <w:name w:val="Intense Quote"/>
-    <w:basedOn w:val="Normal"/>
-    <w:next w:val="Normal"/>
-    <w:link w:val="IntenseQuoteChar"/>
+    <w:basedOn w:val="a"/>
+    <w:next w:val="a"/>
+    <w:link w:val="aa"/>
     <w:uiPriority w:val="30"/>
     <w:qFormat/>
     <w:rsid w:val="0048629A"/>
@@ -5973,10 +6712,10 @@
       <w:color w:val="0F4761" w:themeColor="accent1" w:themeShade="BF"/>
     </w:rPr>
   </w:style>
-  <w:style w:type="character" w:customStyle="1" w:styleId="IntenseQuoteChar">
-    <w:name w:val="Intense Quote Char"/>
-    <w:basedOn w:val="DefaultParagraphFont"/>
-    <w:link w:val="IntenseQuote"/>
+  <w:style w:type="character" w:customStyle="1" w:styleId="aa">
+    <w:name w:val="Выделенная цитата Знак"/>
+    <w:basedOn w:val="a0"/>
+    <w:link w:val="a9"/>
     <w:uiPriority w:val="30"/>
     <w:rsid w:val="0048629A"/>
     <w:rPr>
@@ -5985,9 +6724,9 @@
       <w:color w:val="0F4761" w:themeColor="accent1" w:themeShade="BF"/>
     </w:rPr>
   </w:style>
-  <w:style w:type="character" w:styleId="IntenseReference">
+  <w:style w:type="character" w:styleId="ab">
     <w:name w:val="Intense Reference"/>
-    <w:basedOn w:val="DefaultParagraphFont"/>
+    <w:basedOn w:val="a0"/>
     <w:uiPriority w:val="32"/>
     <w:qFormat/>
     <w:rsid w:val="0048629A"/>
@@ -5999,10 +6738,10 @@
       <w:spacing w:val="5"/>
     </w:rPr>
   </w:style>
-  <w:style w:type="paragraph" w:styleId="Header">
+  <w:style w:type="paragraph" w:styleId="ac">
     <w:name w:val="header"/>
-    <w:basedOn w:val="Normal"/>
-    <w:link w:val="HeaderChar"/>
+    <w:basedOn w:val="a"/>
+    <w:link w:val="ad"/>
     <w:uiPriority w:val="99"/>
     <w:unhideWhenUsed/>
     <w:rsid w:val="00EC6723"/>
@@ -6014,20 +6753,20 @@
       <w:spacing w:after="0" w:line="240" w:lineRule="auto"/>
     </w:pPr>
   </w:style>
-  <w:style w:type="character" w:customStyle="1" w:styleId="HeaderChar">
-    <w:name w:val="Header Char"/>
-    <w:basedOn w:val="DefaultParagraphFont"/>
-    <w:link w:val="Header"/>
+  <w:style w:type="character" w:customStyle="1" w:styleId="ad">
+    <w:name w:val="Верхний колонтитул Знак"/>
+    <w:basedOn w:val="a0"/>
+    <w:link w:val="ac"/>
     <w:uiPriority w:val="99"/>
     <w:rsid w:val="00EC6723"/>
     <w:rPr>
       <w:rFonts w:ascii="Times New Roman" w:hAnsi="Times New Roman"/>
     </w:rPr>
   </w:style>
-  <w:style w:type="paragraph" w:styleId="Footer">
+  <w:style w:type="paragraph" w:styleId="ae">
     <w:name w:val="footer"/>
-    <w:basedOn w:val="Normal"/>
-    <w:link w:val="FooterChar"/>
+    <w:basedOn w:val="a"/>
+    <w:link w:val="af"/>
     <w:uiPriority w:val="99"/>
     <w:unhideWhenUsed/>
     <w:rsid w:val="00EC6723"/>
@@ -6039,19 +6778,19 @@
       <w:spacing w:after="0" w:line="240" w:lineRule="auto"/>
     </w:pPr>
   </w:style>
-  <w:style w:type="character" w:customStyle="1" w:styleId="FooterChar">
-    <w:name w:val="Footer Char"/>
-    <w:basedOn w:val="DefaultParagraphFont"/>
-    <w:link w:val="Footer"/>
+  <w:style w:type="character" w:customStyle="1" w:styleId="af">
+    <w:name w:val="Нижний колонтитул Знак"/>
+    <w:basedOn w:val="a0"/>
+    <w:link w:val="ae"/>
     <w:uiPriority w:val="99"/>
     <w:rsid w:val="00EC6723"/>
     <w:rPr>
       <w:rFonts w:ascii="Times New Roman" w:hAnsi="Times New Roman"/>
     </w:rPr>
   </w:style>
-  <w:style w:type="paragraph" w:styleId="NoSpacing">
+  <w:style w:type="paragraph" w:styleId="af0">
     <w:name w:val="No Spacing"/>
-    <w:link w:val="NoSpacingChar"/>
+    <w:link w:val="af1"/>
     <w:uiPriority w:val="1"/>
     <w:qFormat/>
     <w:rsid w:val="00C46936"/>
@@ -6067,10 +6806,10 @@
       <w14:ligatures w14:val="none"/>
     </w:rPr>
   </w:style>
-  <w:style w:type="character" w:customStyle="1" w:styleId="NoSpacingChar">
-    <w:name w:val="No Spacing Char"/>
-    <w:basedOn w:val="DefaultParagraphFont"/>
-    <w:link w:val="NoSpacing"/>
+  <w:style w:type="character" w:customStyle="1" w:styleId="af1">
+    <w:name w:val="Без интервала Знак"/>
+    <w:basedOn w:val="a0"/>
+    <w:link w:val="af0"/>
     <w:uiPriority w:val="1"/>
     <w:rsid w:val="00C46936"/>
     <w:rPr>
@@ -6082,10 +6821,10 @@
       <w14:ligatures w14:val="none"/>
     </w:rPr>
   </w:style>
-  <w:style w:type="paragraph" w:styleId="TOCHeading">
+  <w:style w:type="paragraph" w:styleId="af2">
     <w:name w:val="TOC Heading"/>
-    <w:basedOn w:val="Heading1"/>
-    <w:next w:val="Normal"/>
+    <w:basedOn w:val="1"/>
+    <w:next w:val="a"/>
     <w:uiPriority w:val="39"/>
     <w:unhideWhenUsed/>
     <w:qFormat/>
@@ -6104,10 +6843,10 @@
       <w14:ligatures w14:val="none"/>
     </w:rPr>
   </w:style>
-  <w:style w:type="paragraph" w:styleId="TOC2">
+  <w:style w:type="paragraph" w:styleId="23">
     <w:name w:val="toc 2"/>
-    <w:basedOn w:val="Normal"/>
-    <w:next w:val="Normal"/>
+    <w:basedOn w:val="a"/>
+    <w:next w:val="a"/>
     <w:autoRedefine/>
     <w:uiPriority w:val="39"/>
     <w:unhideWhenUsed/>
@@ -6117,10 +6856,10 @@
       <w:ind w:left="240"/>
     </w:pPr>
   </w:style>
-  <w:style w:type="paragraph" w:styleId="TOC1">
+  <w:style w:type="paragraph" w:styleId="11">
     <w:name w:val="toc 1"/>
-    <w:basedOn w:val="Normal"/>
-    <w:next w:val="Normal"/>
+    <w:basedOn w:val="a"/>
+    <w:next w:val="a"/>
     <w:autoRedefine/>
     <w:uiPriority w:val="39"/>
     <w:unhideWhenUsed/>
@@ -6129,9 +6868,9 @@
       <w:spacing w:after="100"/>
     </w:pPr>
   </w:style>
-  <w:style w:type="character" w:styleId="Hyperlink">
+  <w:style w:type="character" w:styleId="af3">
     <w:name w:val="Hyperlink"/>
-    <w:basedOn w:val="DefaultParagraphFont"/>
+    <w:basedOn w:val="a0"/>
     <w:uiPriority w:val="99"/>
     <w:unhideWhenUsed/>
     <w:rsid w:val="00DC1291"/>
@@ -6140,10 +6879,10 @@
       <w:u w:val="single"/>
     </w:rPr>
   </w:style>
-  <w:style w:type="paragraph" w:styleId="Caption">
+  <w:style w:type="paragraph" w:styleId="af4">
     <w:name w:val="caption"/>
-    <w:basedOn w:val="Normal"/>
-    <w:next w:val="Normal"/>
+    <w:basedOn w:val="a"/>
+    <w:next w:val="a"/>
     <w:uiPriority w:val="35"/>
     <w:unhideWhenUsed/>
     <w:qFormat/>
@@ -6159,9 +6898,9 @@
       <w:szCs w:val="18"/>
     </w:rPr>
   </w:style>
-  <w:style w:type="character" w:styleId="UnresolvedMention">
+  <w:style w:type="character" w:styleId="af5">
     <w:name w:val="Unresolved Mention"/>
-    <w:basedOn w:val="DefaultParagraphFont"/>
+    <w:basedOn w:val="a0"/>
     <w:uiPriority w:val="99"/>
     <w:semiHidden/>
     <w:unhideWhenUsed/>
@@ -6171,9 +6910,9 @@
       <w:shd w:val="clear" w:color="auto" w:fill="E1DFDD"/>
     </w:rPr>
   </w:style>
-  <w:style w:type="character" w:styleId="FollowedHyperlink">
+  <w:style w:type="character" w:styleId="af6">
     <w:name w:val="FollowedHyperlink"/>
-    <w:basedOn w:val="DefaultParagraphFont"/>
+    <w:basedOn w:val="a0"/>
     <w:uiPriority w:val="99"/>
     <w:semiHidden/>
     <w:unhideWhenUsed/>
@@ -6183,7 +6922,7 @@
       <w:u w:val="single"/>
     </w:rPr>
   </w:style>
-  <w:style w:type="paragraph" w:styleId="Revision">
+  <w:style w:type="paragraph" w:styleId="af7">
     <w:name w:val="Revision"/>
     <w:hidden/>
     <w:uiPriority w:val="99"/>
@@ -6197,10 +6936,10 @@
       <w:sz w:val="28"/>
     </w:rPr>
   </w:style>
-  <w:style w:type="paragraph" w:styleId="TOC3">
+  <w:style w:type="paragraph" w:styleId="31">
     <w:name w:val="toc 3"/>
-    <w:basedOn w:val="Normal"/>
-    <w:next w:val="Normal"/>
+    <w:basedOn w:val="a"/>
+    <w:next w:val="a"/>
     <w:autoRedefine/>
     <w:uiPriority w:val="39"/>
     <w:unhideWhenUsed/>
@@ -6210,9 +6949,9 @@
       <w:ind w:left="560"/>
     </w:pPr>
   </w:style>
-  <w:style w:type="table" w:styleId="TableGrid">
+  <w:style w:type="table" w:styleId="af8">
     <w:name w:val="Table Grid"/>
-    <w:basedOn w:val="TableNormal"/>
+    <w:basedOn w:val="a1"/>
     <w:uiPriority w:val="39"/>
     <w:rsid w:val="00FA43B4"/>
     <w:pPr>
@@ -6231,7 +6970,7 @@
   </w:style>
   <w:style w:type="paragraph" w:customStyle="1" w:styleId="p1">
     <w:name w:val="p1"/>
-    <w:basedOn w:val="Normal"/>
+    <w:basedOn w:val="a"/>
     <w:rsid w:val="00C3779A"/>
     <w:pPr>
       <w:spacing w:before="100" w:beforeAutospacing="1" w:after="100" w:afterAutospacing="1" w:line="240" w:lineRule="auto"/>
@@ -6246,7 +6985,7 @@
   </w:style>
   <w:style w:type="paragraph" w:customStyle="1" w:styleId="p2">
     <w:name w:val="p2"/>
-    <w:basedOn w:val="Normal"/>
+    <w:basedOn w:val="a"/>
     <w:rsid w:val="00ED1914"/>
     <w:pPr>
       <w:spacing w:before="100" w:beforeAutospacing="1" w:after="100" w:afterAutospacing="1" w:line="240" w:lineRule="auto"/>
@@ -6255,18 +6994,18 @@
       <w:rFonts w:eastAsia="Times New Roman" w:cs="Times New Roman"/>
       <w:kern w:val="0"/>
       <w:sz w:val="24"/>
-      <w:lang w:val="en-RU" w:eastAsia="en-GB"/>
+      <w:lang w:eastAsia="en-GB"/>
       <w14:ligatures w14:val="none"/>
     </w:rPr>
   </w:style>
   <w:style w:type="character" w:customStyle="1" w:styleId="apple-converted-space">
     <w:name w:val="apple-converted-space"/>
-    <w:basedOn w:val="DefaultParagraphFont"/>
+    <w:basedOn w:val="a0"/>
     <w:rsid w:val="00ED1914"/>
   </w:style>
   <w:style w:type="paragraph" w:customStyle="1" w:styleId="p3">
     <w:name w:val="p3"/>
-    <w:basedOn w:val="Normal"/>
+    <w:basedOn w:val="a"/>
     <w:rsid w:val="00ED1914"/>
     <w:pPr>
       <w:spacing w:before="100" w:beforeAutospacing="1" w:after="100" w:afterAutospacing="1" w:line="240" w:lineRule="auto"/>
@@ -6275,19 +7014,49 @@
       <w:rFonts w:eastAsia="Times New Roman" w:cs="Times New Roman"/>
       <w:kern w:val="0"/>
       <w:sz w:val="24"/>
-      <w:lang w:val="en-RU" w:eastAsia="en-GB"/>
+      <w:lang w:eastAsia="en-GB"/>
       <w14:ligatures w14:val="none"/>
     </w:rPr>
   </w:style>
-  <w:style w:type="character" w:styleId="Strong">
+  <w:style w:type="character" w:styleId="af9">
     <w:name w:val="Strong"/>
-    <w:basedOn w:val="DefaultParagraphFont"/>
+    <w:basedOn w:val="a0"/>
     <w:uiPriority w:val="22"/>
     <w:qFormat/>
     <w:rsid w:val="006F05E5"/>
     <w:rPr>
       <w:b/>
       <w:bCs/>
+    </w:rPr>
+  </w:style>
+  <w:style w:type="paragraph" w:styleId="HTML">
+    <w:name w:val="HTML Preformatted"/>
+    <w:basedOn w:val="a"/>
+    <w:link w:val="HTML0"/>
+    <w:uiPriority w:val="99"/>
+    <w:semiHidden/>
+    <w:unhideWhenUsed/>
+    <w:rsid w:val="005E5335"/>
+    <w:pPr>
+      <w:spacing w:after="0" w:line="240" w:lineRule="auto"/>
+    </w:pPr>
+    <w:rPr>
+      <w:rFonts w:ascii="Consolas" w:hAnsi="Consolas"/>
+      <w:sz w:val="20"/>
+      <w:szCs w:val="20"/>
+    </w:rPr>
+  </w:style>
+  <w:style w:type="character" w:customStyle="1" w:styleId="HTML0">
+    <w:name w:val="Стандартный HTML Знак"/>
+    <w:basedOn w:val="a0"/>
+    <w:link w:val="HTML"/>
+    <w:uiPriority w:val="99"/>
+    <w:semiHidden/>
+    <w:rsid w:val="005E5335"/>
+    <w:rPr>
+      <w:rFonts w:ascii="Consolas" w:hAnsi="Consolas"/>
+      <w:sz w:val="20"/>
+      <w:szCs w:val="20"/>
     </w:rPr>
   </w:style>
 </w:styles>

</xml_diff>